<commit_message>
KeyCloak auth server authetication using opaque token  (for opaque token keep in mindwe need to go to keycloak and need to add audience)
</commit_message>
<xml_diff>
--- a/Important things.docx
+++ b/Important things.docx
@@ -1821,30 +1821,51 @@
       </w:pPr>
       <w:r>
         <w:rPr>
-          <w:lang w:val="en-IN"/>
-        </w:rPr>
-        <w:t>JWT- If we use this then resource server no need to access Auth server to verify the access token send by client server (it uses jwt private public key strategy not the signature signing one)</w:t>
-      </w:r>
-    </w:p>
-    <w:p>
-      <w:pPr>
-        <w:rPr>
-          <w:lang w:val="en-IN"/>
-        </w:rPr>
-      </w:pPr>
-    </w:p>
-    <w:p>
-      <w:pPr>
-        <w:rPr>
-          <w:lang w:val="en-IN"/>
-        </w:rPr>
-      </w:pPr>
-      <w:r>
-        <w:rPr>
-          <w:lang w:val="en-IN"/>
-        </w:rPr>
-        <w:t>Opaque-It is just a string value that contains no meaningfull data like the JESSION token here to validate access token resource server sent request to auth server.</w:t>
-      </w:r>
+          <w:color w:val="FF0000"/>
+          <w:lang w:val="en-IN"/>
+        </w:rPr>
+        <w:t>JWT</w:t>
+      </w:r>
+      <w:r>
+        <w:rPr>
+          <w:lang w:val="en-IN"/>
+        </w:rPr>
+        <w:t>- If we use this then resource server no need to access Auth server to verify the access token send by client server (it uses jwt private public key strategy not the signature signing one)</w:t>
+      </w:r>
+    </w:p>
+    <w:p>
+      <w:pPr>
+        <w:rPr>
+          <w:lang w:val="en-IN"/>
+        </w:rPr>
+      </w:pPr>
+    </w:p>
+    <w:p>
+      <w:pPr>
+        <w:rPr>
+          <w:lang w:val="en-IN"/>
+        </w:rPr>
+      </w:pPr>
+      <w:r>
+        <w:rPr>
+          <w:color w:val="FF0000"/>
+          <w:lang w:val="en-IN"/>
+        </w:rPr>
+        <w:t>Opaque</w:t>
+      </w:r>
+      <w:r>
+        <w:rPr>
+          <w:lang w:val="en-IN"/>
+        </w:rPr>
+        <w:t>-It is just a string value that contains no meaningfull data like the JESSION token here to validate access token resource server sent request to auth server.</w:t>
+      </w:r>
+    </w:p>
+    <w:p>
+      <w:pPr>
+        <w:rPr>
+          <w:lang w:val="en-IN"/>
+        </w:rPr>
+      </w:pPr>
     </w:p>
     <w:p>
       <w:pPr>
@@ -1979,6 +2000,32 @@
           <w:lang w:val="en-IN"/>
         </w:rPr>
         <w:t xml:space="preserve"> </w:t>
+      </w:r>
+    </w:p>
+    <w:p>
+      <w:pPr>
+        <w:rPr>
+          <w:lang w:val="en-IN"/>
+        </w:rPr>
+      </w:pPr>
+    </w:p>
+    <w:p>
+      <w:pPr>
+        <w:rPr>
+          <w:lang w:val="en-IN"/>
+        </w:rPr>
+      </w:pPr>
+      <w:r>
+        <w:rPr>
+          <w:lang w:val="en-IN"/>
+        </w:rPr>
+        <w:t xml:space="preserve">When we use Opaque token setup in keycloack then we have to add client scope for the client </w:t>
+      </w:r>
+      <w:r>
+        <w:rPr>
+          <w:lang w:val="en-IN"/>
+        </w:rPr>
+        <w:t>then only it will work</w:t>
       </w:r>
     </w:p>
     <w:p>

</xml_diff>

<commit_message>
Learned Authorization grant type and pkce grant type (the code inside reourse server is just the same (spring boot code) no change) in pkce we use it for angular when we cant store client data in angular so for that we need to make some changes in angular while senting data and calling keyclock for login(check from app.module.ts). Also Learned mfa and sso setup in keyclock
</commit_message>
<xml_diff>
--- a/Important things.docx
+++ b/Important things.docx
@@ -17,7 +17,15 @@
     </w:p>
     <w:p>
       <w:r>
-        <w:t>(securityfilter chain -&gt; Authentication Manager (Authenticate) -&gt; Authentication provider(DOAautheticationProvider</w:t>
+        <w:t xml:space="preserve">(securityfilter chain -&gt; Authentication Manager (Authenticate) -&gt; Authentication </w:t>
+      </w:r>
+      <w:proofErr w:type="gramStart"/>
+      <w:r>
+        <w:t>provider(</w:t>
+      </w:r>
+      <w:proofErr w:type="gramEnd"/>
+      <w:r>
+        <w:t>DOAautheticationProvider</w:t>
       </w:r>
       <w:r>
         <w:rPr>
@@ -80,7 +88,21 @@
         <w:rPr>
           <w:lang w:val="en-IN"/>
         </w:rPr>
-        <w:t xml:space="preserve">We have to send data in header as Authorization: basic (Enocoded value of username and pasword) from frontend and this is taken by basicAutheticationFilter and rest it will do (calls default authetication manager and then authentication provider).For subsequent calls also we need to sent in header the Authorization: basic (Enocoded value of username and pasword) </w:t>
+        <w:t>We have to send data in header as Authorization: basic (Enocoded value of username and pasword) from frontend and this is taken by basicAutheticationFilter and rest it will do (calls default authetication manager and then authentication provider</w:t>
+      </w:r>
+      <w:proofErr w:type="gramStart"/>
+      <w:r>
+        <w:rPr>
+          <w:lang w:val="en-IN"/>
+        </w:rPr>
+        <w:t>).For</w:t>
+      </w:r>
+      <w:proofErr w:type="gramEnd"/>
+      <w:r>
+        <w:rPr>
+          <w:lang w:val="en-IN"/>
+        </w:rPr>
+        <w:t xml:space="preserve"> subsequent calls also we need to sent in header the Authorization: basic (Enocoded value of username and pasword) </w:t>
       </w:r>
     </w:p>
     <w:p>
@@ -123,7 +145,21 @@
         <w:rPr>
           <w:lang w:val="en-IN"/>
         </w:rPr>
-        <w:t>To use that from frontend we have to sent data to /login default page (no need to mention anywhere spring knows it) when we send data it should be of the form “x-www-form-urlenocoded” format not in json format and it is then intercepted by UserNamePasswordAuthenticationFilter and rest it will do. Subsequent calls there is no need to do anything browser will automatically sent the cookie for authentication</w:t>
+        <w:t xml:space="preserve">To use that from frontend we have to sent data to /login default page (no need to mention anywhere spring knows it) when we send data it should be of the form “x-www-form-urlenocoded” format not in json format and it is then intercepted by UserNamePasswordAuthenticationFilter and rest it will do. Subsequent calls there is no need to do anything browser will automatically </w:t>
+      </w:r>
+      <w:proofErr w:type="gramStart"/>
+      <w:r>
+        <w:rPr>
+          <w:lang w:val="en-IN"/>
+        </w:rPr>
+        <w:t>sent</w:t>
+      </w:r>
+      <w:proofErr w:type="gramEnd"/>
+      <w:r>
+        <w:rPr>
+          <w:lang w:val="en-IN"/>
+        </w:rPr>
+        <w:t xml:space="preserve"> the cookie for authentication</w:t>
       </w:r>
     </w:p>
     <w:p>
@@ -189,10 +225,21 @@
         <w:rPr>
           <w:highlight w:val="cyan"/>
         </w:rPr>
-        <w:t>Differnce between userDetailManage</w:t>
-      </w:r>
-      <w:r>
-        <w:t xml:space="preserve">r(to create user,delete,update etc like the InmemoryuserDetailManager and JDBCuserDetailManager) </w:t>
+        <w:t xml:space="preserve">Differnce between </w:t>
+      </w:r>
+      <w:proofErr w:type="gramStart"/>
+      <w:r>
+        <w:rPr>
+          <w:highlight w:val="cyan"/>
+        </w:rPr>
+        <w:t>userDetailManage</w:t>
+      </w:r>
+      <w:r>
+        <w:t>r(</w:t>
+      </w:r>
+      <w:proofErr w:type="gramEnd"/>
+      <w:r>
+        <w:t xml:space="preserve">to create user,delete,update etc like the InmemoryuserDetailManager and JDBCuserDetailManager) </w:t>
       </w:r>
       <w:r>
         <w:rPr>
@@ -302,7 +349,23 @@
           <w:highlight w:val="cyan"/>
           <w:lang w:val="en-IN"/>
         </w:rPr>
-        <w:t>Using Interface we can call the object with parent name</w:t>
+        <w:t xml:space="preserve">Using </w:t>
+      </w:r>
+      <w:proofErr w:type="gramStart"/>
+      <w:r>
+        <w:rPr>
+          <w:highlight w:val="cyan"/>
+          <w:lang w:val="en-IN"/>
+        </w:rPr>
+        <w:t>Interface</w:t>
+      </w:r>
+      <w:proofErr w:type="gramEnd"/>
+      <w:r>
+        <w:rPr>
+          <w:highlight w:val="cyan"/>
+          <w:lang w:val="en-IN"/>
+        </w:rPr>
+        <w:t xml:space="preserve"> we can call the object with parent name</w:t>
       </w:r>
     </w:p>
     <w:p/>
@@ -314,7 +377,15 @@
     </w:p>
     <w:p>
       <w:r>
-        <w:t>Animal animal = new Dog();</w:t>
+        <w:t xml:space="preserve">Animal animal = new </w:t>
+      </w:r>
+      <w:proofErr w:type="gramStart"/>
+      <w:r>
+        <w:t>Dog(</w:t>
+      </w:r>
+      <w:proofErr w:type="gramEnd"/>
+      <w:r>
+        <w:t>);</w:t>
       </w:r>
     </w:p>
     <w:p>
@@ -357,7 +428,35 @@
         <w:rPr>
           <w:lang w:val="en-IN"/>
         </w:rPr>
-        <w:t>Normally when we use jpaRepositoy for doing database action by default we have findById,findAll etc we can also add custom methods in the interface no need to mention its content just mention function name and jpa will automatically understand and find the data. But we need to maintain some naming convention for it to understand like findByEmail so it know we need to find record with this given email</w:t>
+        <w:t xml:space="preserve">Normally when we use jpaRepositoy for doing database action by default we have </w:t>
+      </w:r>
+      <w:proofErr w:type="gramStart"/>
+      <w:r>
+        <w:rPr>
+          <w:lang w:val="en-IN"/>
+        </w:rPr>
+        <w:t>findById,findAll</w:t>
+      </w:r>
+      <w:proofErr w:type="gramEnd"/>
+      <w:r>
+        <w:rPr>
+          <w:lang w:val="en-IN"/>
+        </w:rPr>
+        <w:t xml:space="preserve"> etc we can also add custom methods in the interface no need to mention its content just mention function name and jpa will automatically understand and find the data. But we need to maintain some naming convention for it to understand like findByEmail so it </w:t>
+      </w:r>
+      <w:proofErr w:type="gramStart"/>
+      <w:r>
+        <w:rPr>
+          <w:lang w:val="en-IN"/>
+        </w:rPr>
+        <w:t>know</w:t>
+      </w:r>
+      <w:proofErr w:type="gramEnd"/>
+      <w:r>
+        <w:rPr>
+          <w:lang w:val="en-IN"/>
+        </w:rPr>
+        <w:t xml:space="preserve"> we need to find record with this given email</w:t>
       </w:r>
     </w:p>
     <w:p>
@@ -440,7 +539,21 @@
         <w:rPr>
           <w:lang w:val="en-IN"/>
         </w:rPr>
-        <w:t xml:space="preserve"> (not used to store password as it can be easily decoded. Encoding can be done using ASCII,BASE64) etc (usally used to sent images vidio where it will be sent in ecoded format and when reciever receive it will be decoded)</w:t>
+        <w:t xml:space="preserve"> (not used to store password as it can be easily decoded. Encoding can be done using </w:t>
+      </w:r>
+      <w:proofErr w:type="gramStart"/>
+      <w:r>
+        <w:rPr>
+          <w:lang w:val="en-IN"/>
+        </w:rPr>
+        <w:t>ASCII,BASE</w:t>
+      </w:r>
+      <w:proofErr w:type="gramEnd"/>
+      <w:r>
+        <w:rPr>
+          <w:lang w:val="en-IN"/>
+        </w:rPr>
+        <w:t>64) etc (usally used to sent images vidio where it will be sent in ecoded format and when reciever receive it will be decoded)</w:t>
       </w:r>
     </w:p>
     <w:p>
@@ -487,27 +600,49 @@
         <w:rPr>
           <w:lang w:val="en-IN"/>
         </w:rPr>
-        <w:t>2 type</w:t>
-      </w:r>
-    </w:p>
-    <w:p>
-      <w:pPr>
-        <w:rPr>
-          <w:lang w:val="en-IN"/>
-        </w:rPr>
-      </w:pPr>
-    </w:p>
-    <w:p>
-      <w:pPr>
-        <w:rPr>
-          <w:lang w:val="en-IN"/>
-        </w:rPr>
-      </w:pPr>
-      <w:r>
-        <w:rPr>
-          <w:lang w:val="en-IN"/>
-        </w:rPr>
-        <w:t>Symetric-  here we just have one key and that is used for encryption and decryptiom ( the issue is secreat key is given to 3</w:t>
+        <w:t xml:space="preserve">2 </w:t>
+      </w:r>
+      <w:proofErr w:type="gramStart"/>
+      <w:r>
+        <w:rPr>
+          <w:lang w:val="en-IN"/>
+        </w:rPr>
+        <w:t>type</w:t>
+      </w:r>
+      <w:proofErr w:type="gramEnd"/>
+    </w:p>
+    <w:p>
+      <w:pPr>
+        <w:rPr>
+          <w:lang w:val="en-IN"/>
+        </w:rPr>
+      </w:pPr>
+    </w:p>
+    <w:p>
+      <w:pPr>
+        <w:rPr>
+          <w:lang w:val="en-IN"/>
+        </w:rPr>
+      </w:pPr>
+      <w:r>
+        <w:rPr>
+          <w:lang w:val="en-IN"/>
+        </w:rPr>
+        <w:t>Symetric</w:t>
+      </w:r>
+      <w:proofErr w:type="gramStart"/>
+      <w:r>
+        <w:rPr>
+          <w:lang w:val="en-IN"/>
+        </w:rPr>
+        <w:t>-  here</w:t>
+      </w:r>
+      <w:proofErr w:type="gramEnd"/>
+      <w:r>
+        <w:rPr>
+          <w:lang w:val="en-IN"/>
+        </w:rPr>
+        <w:t xml:space="preserve"> we just have one key and that is used for encryption and decryptiom ( the issue is secreat key is given to 3</w:t>
       </w:r>
       <w:r>
         <w:rPr>
@@ -540,7 +675,21 @@
         <w:rPr>
           <w:lang w:val="en-IN"/>
         </w:rPr>
-        <w:t>Ascemetric-here 2 key are generated public and private so public key is given to everyone which they use to encryt and they sent this and decrption is done using private ket and this is only there with that person (inside the main orngainzation whi genrate private and public key  people may steal private key)</w:t>
+        <w:t xml:space="preserve">Ascemetric-here 2 key are generated public and private so public key is given to everyone which they use to encryt and they sent this and decrption is done using private ket and this is only there with that person (inside the main orngainzation whi genrate private and public </w:t>
+      </w:r>
+      <w:proofErr w:type="gramStart"/>
+      <w:r>
+        <w:rPr>
+          <w:lang w:val="en-IN"/>
+        </w:rPr>
+        <w:t>key  people</w:t>
+      </w:r>
+      <w:proofErr w:type="gramEnd"/>
+      <w:r>
+        <w:rPr>
+          <w:lang w:val="en-IN"/>
+        </w:rPr>
+        <w:t xml:space="preserve"> may steal private key)</w:t>
       </w:r>
     </w:p>
     <w:p>
@@ -557,32 +706,69 @@
           <w:lang w:val="en-IN"/>
         </w:rPr>
       </w:pPr>
+      <w:proofErr w:type="gramStart"/>
       <w:r>
         <w:rPr>
           <w:highlight w:val="red"/>
           <w:lang w:val="en-IN"/>
         </w:rPr>
-        <w:t>Hashing(eg bcrypt)</w:t>
-      </w:r>
-    </w:p>
-    <w:p>
-      <w:pPr>
-        <w:rPr>
-          <w:lang w:val="en-IN"/>
-        </w:rPr>
-      </w:pPr>
-    </w:p>
-    <w:p>
-      <w:pPr>
-        <w:rPr>
-          <w:lang w:val="en-IN"/>
-        </w:rPr>
-      </w:pPr>
-      <w:r>
-        <w:rPr>
-          <w:lang w:val="en-IN"/>
-        </w:rPr>
-        <w:t>Best way to store password in database is through hashing because it is one way. One hashed password cant be dehashed to get the plain password. There are many hashing method. If we decide to use one it will always produce same length result for any input we give and also if we give same input again the hashed value will also be same everytime.</w:t>
+        <w:t>Hashing(</w:t>
+      </w:r>
+      <w:proofErr w:type="gramEnd"/>
+      <w:r>
+        <w:rPr>
+          <w:highlight w:val="red"/>
+          <w:lang w:val="en-IN"/>
+        </w:rPr>
+        <w:t>eg bcrypt)</w:t>
+      </w:r>
+    </w:p>
+    <w:p>
+      <w:pPr>
+        <w:rPr>
+          <w:lang w:val="en-IN"/>
+        </w:rPr>
+      </w:pPr>
+    </w:p>
+    <w:p>
+      <w:pPr>
+        <w:rPr>
+          <w:lang w:val="en-IN"/>
+        </w:rPr>
+      </w:pPr>
+      <w:r>
+        <w:rPr>
+          <w:lang w:val="en-IN"/>
+        </w:rPr>
+        <w:t xml:space="preserve">Best way to store password in database is through hashing because it is one way. One hashed password </w:t>
+      </w:r>
+      <w:proofErr w:type="gramStart"/>
+      <w:r>
+        <w:rPr>
+          <w:lang w:val="en-IN"/>
+        </w:rPr>
+        <w:t>cant</w:t>
+      </w:r>
+      <w:proofErr w:type="gramEnd"/>
+      <w:r>
+        <w:rPr>
+          <w:lang w:val="en-IN"/>
+        </w:rPr>
+        <w:t xml:space="preserve"> be dehashed to get the plain password. There are many hashing </w:t>
+      </w:r>
+      <w:proofErr w:type="gramStart"/>
+      <w:r>
+        <w:rPr>
+          <w:lang w:val="en-IN"/>
+        </w:rPr>
+        <w:t>method</w:t>
+      </w:r>
+      <w:proofErr w:type="gramEnd"/>
+      <w:r>
+        <w:rPr>
+          <w:lang w:val="en-IN"/>
+        </w:rPr>
+        <w:t>. If we decide to use one it will always produce same length result for any input we give and also if we give same input again the hashed value will also be same everytime.</w:t>
       </w:r>
     </w:p>
     <w:p>
@@ -622,27 +808,55 @@
         <w:rPr>
           <w:lang w:val="en-IN"/>
         </w:rPr>
-        <w:t>Brute force-since each time for a password same hash is returned if hacker get access to the database they can try out different password and check if the hash matches with those hacked data</w:t>
-      </w:r>
-    </w:p>
-    <w:p>
-      <w:pPr>
-        <w:rPr>
-          <w:lang w:val="en-IN"/>
-        </w:rPr>
-      </w:pPr>
-    </w:p>
-    <w:p>
-      <w:pPr>
-        <w:rPr>
-          <w:lang w:val="en-IN"/>
-        </w:rPr>
-      </w:pPr>
-      <w:r>
-        <w:rPr>
-          <w:lang w:val="en-IN"/>
-        </w:rPr>
-        <w:t xml:space="preserve">Table issue- All possible passwords hash are already stored in a table </w:t>
+        <w:t xml:space="preserve">Brute force-since each time for a password same hash is returned if hacker get access to the </w:t>
+      </w:r>
+      <w:proofErr w:type="gramStart"/>
+      <w:r>
+        <w:rPr>
+          <w:lang w:val="en-IN"/>
+        </w:rPr>
+        <w:t>database</w:t>
+      </w:r>
+      <w:proofErr w:type="gramEnd"/>
+      <w:r>
+        <w:rPr>
+          <w:lang w:val="en-IN"/>
+        </w:rPr>
+        <w:t xml:space="preserve"> they can try out different password and check if the hash matches with those hacked data</w:t>
+      </w:r>
+    </w:p>
+    <w:p>
+      <w:pPr>
+        <w:rPr>
+          <w:lang w:val="en-IN"/>
+        </w:rPr>
+      </w:pPr>
+    </w:p>
+    <w:p>
+      <w:pPr>
+        <w:rPr>
+          <w:lang w:val="en-IN"/>
+        </w:rPr>
+      </w:pPr>
+      <w:r>
+        <w:rPr>
+          <w:lang w:val="en-IN"/>
+        </w:rPr>
+        <w:t xml:space="preserve">Table issue- All possible passwords hash </w:t>
+      </w:r>
+      <w:proofErr w:type="gramStart"/>
+      <w:r>
+        <w:rPr>
+          <w:lang w:val="en-IN"/>
+        </w:rPr>
+        <w:t>are</w:t>
+      </w:r>
+      <w:proofErr w:type="gramEnd"/>
+      <w:r>
+        <w:rPr>
+          <w:lang w:val="en-IN"/>
+        </w:rPr>
+        <w:t xml:space="preserve"> already stored in a table </w:t>
       </w:r>
     </w:p>
     <w:p>
@@ -698,12 +912,20 @@
           <w:lang w:val="en-IN"/>
         </w:rPr>
       </w:pPr>
+      <w:proofErr w:type="gramStart"/>
       <w:r>
         <w:rPr>
           <w:lang w:val="en-IN"/>
         </w:rPr>
         <w:lastRenderedPageBreak/>
-        <w:t>Also we have to use methods like bcrypts to slow down the hash generation process so that the hacker will take more time to generate hash value.  (solve brute force issue)</w:t>
+        <w:t>Also</w:t>
+      </w:r>
+      <w:proofErr w:type="gramEnd"/>
+      <w:r>
+        <w:rPr>
+          <w:lang w:val="en-IN"/>
+        </w:rPr>
+        <w:t xml:space="preserve"> we have to use methods like bcrypts to slow down the hash generation process so that the hacker will take more time to generate hash value.  (solve brute force issue)</w:t>
       </w:r>
     </w:p>
     <w:p>
@@ -785,7 +1007,21 @@
         <w:rPr>
           <w:lang w:val="en-IN"/>
         </w:rPr>
-        <w:t xml:space="preserve">There are mainly two type error 401 not authenticated (wrong credential)  and 403 not authorized (no role) </w:t>
+        <w:t xml:space="preserve">There are mainly two type error 401 not authenticated (wrong </w:t>
+      </w:r>
+      <w:proofErr w:type="gramStart"/>
+      <w:r>
+        <w:rPr>
+          <w:lang w:val="en-IN"/>
+        </w:rPr>
+        <w:t>credential)  and</w:t>
+      </w:r>
+      <w:proofErr w:type="gramEnd"/>
+      <w:r>
+        <w:rPr>
+          <w:lang w:val="en-IN"/>
+        </w:rPr>
+        <w:t xml:space="preserve"> 403 not authorized (no role) </w:t>
       </w:r>
     </w:p>
     <w:p>
@@ -1007,33 +1243,57 @@
           <w:lang w:val="en-IN"/>
         </w:rPr>
       </w:pPr>
-      <w:r>
-        <w:rPr>
-          <w:lang w:val="en-IN"/>
-        </w:rPr>
-        <w:t>Alo we need to mention them in security file for it to be working</w:t>
-      </w:r>
-    </w:p>
-    <w:p>
-      <w:pPr>
-        <w:rPr>
-          <w:lang w:val="en-IN"/>
-        </w:rPr>
-      </w:pPr>
-    </w:p>
-    <w:p>
-      <w:pPr>
-        <w:rPr>
-          <w:highlight w:val="cyan"/>
-          <w:lang w:val="en-IN"/>
-        </w:rPr>
-      </w:pPr>
-      <w:r>
-        <w:rPr>
-          <w:highlight w:val="cyan"/>
-          <w:lang w:val="en-IN"/>
-        </w:rPr>
-        <w:t>But if we want to redirect we cant use the above we need to use .successHandles .FalitureHandler in formLogin see in easyBank Project</w:t>
+      <w:proofErr w:type="gramStart"/>
+      <w:r>
+        <w:rPr>
+          <w:lang w:val="en-IN"/>
+        </w:rPr>
+        <w:t>Alo</w:t>
+      </w:r>
+      <w:proofErr w:type="gramEnd"/>
+      <w:r>
+        <w:rPr>
+          <w:lang w:val="en-IN"/>
+        </w:rPr>
+        <w:t xml:space="preserve"> we need to mention them in security file for it to be working</w:t>
+      </w:r>
+    </w:p>
+    <w:p>
+      <w:pPr>
+        <w:rPr>
+          <w:lang w:val="en-IN"/>
+        </w:rPr>
+      </w:pPr>
+    </w:p>
+    <w:p>
+      <w:pPr>
+        <w:rPr>
+          <w:highlight w:val="cyan"/>
+          <w:lang w:val="en-IN"/>
+        </w:rPr>
+      </w:pPr>
+      <w:r>
+        <w:rPr>
+          <w:highlight w:val="cyan"/>
+          <w:lang w:val="en-IN"/>
+        </w:rPr>
+        <w:t xml:space="preserve">But if we want to redirect we cant use the above we need to </w:t>
+      </w:r>
+      <w:proofErr w:type="gramStart"/>
+      <w:r>
+        <w:rPr>
+          <w:highlight w:val="cyan"/>
+          <w:lang w:val="en-IN"/>
+        </w:rPr>
+        <w:t>use .successHandles</w:t>
+      </w:r>
+      <w:proofErr w:type="gramEnd"/>
+      <w:r>
+        <w:rPr>
+          <w:highlight w:val="cyan"/>
+          <w:lang w:val="en-IN"/>
+        </w:rPr>
+        <w:t xml:space="preserve"> .FalitureHandler in formLogin see in easyBank Project</w:t>
       </w:r>
     </w:p>
     <w:p>
@@ -1090,12 +1350,21 @@
           <w:lang w:val="en-IN"/>
         </w:rPr>
       </w:pPr>
-      <w:r>
-        <w:rPr>
-          <w:highlight w:val="cyan"/>
-          <w:lang w:val="en-IN"/>
-        </w:rPr>
-        <w:t>Cors setup using CorsConfigurationSource</w:t>
+      <w:proofErr w:type="gramStart"/>
+      <w:r>
+        <w:rPr>
+          <w:highlight w:val="cyan"/>
+          <w:lang w:val="en-IN"/>
+        </w:rPr>
+        <w:t>Cors</w:t>
+      </w:r>
+      <w:proofErr w:type="gramEnd"/>
+      <w:r>
+        <w:rPr>
+          <w:highlight w:val="cyan"/>
+          <w:lang w:val="en-IN"/>
+        </w:rPr>
+        <w:t xml:space="preserve"> setup using CorsConfigurationSource</w:t>
       </w:r>
     </w:p>
     <w:p>
@@ -1146,36 +1415,68 @@
           <w:highlight w:val="cyan"/>
           <w:lang w:val="en-IN"/>
         </w:rPr>
-        <w:t>When we use basic authentication it can create a session so from next request onwards we can just use that session to login instead of using basic authentication(that Is sending username password for each request) but basic auth will work even if we delete the session that get created</w:t>
-      </w:r>
-    </w:p>
-    <w:p>
-      <w:pPr>
-        <w:rPr>
-          <w:lang w:val="en-IN"/>
-        </w:rPr>
-      </w:pPr>
-    </w:p>
-    <w:p>
-      <w:pPr>
-        <w:rPr>
-          <w:lang w:val="en-IN"/>
-        </w:rPr>
-      </w:pPr>
-    </w:p>
-    <w:p>
-      <w:pPr>
-        <w:rPr>
-          <w:highlight w:val="cyan"/>
-          <w:lang w:val="en-IN"/>
-        </w:rPr>
-      </w:pPr>
-      <w:r>
-        <w:rPr>
-          <w:highlight w:val="cyan"/>
-          <w:lang w:val="en-IN"/>
-        </w:rPr>
-        <w:t xml:space="preserve">“@EnableWebSecurity(debug = true)” this along with adding in system property “logging.level.org.springframework.security=DEBUG” will allow us to show in the console all security filter used </w:t>
+        <w:t xml:space="preserve">When we use basic authentication it can create a session so from next request onwards we can just use that session to login instead of using basic </w:t>
+      </w:r>
+      <w:proofErr w:type="gramStart"/>
+      <w:r>
+        <w:rPr>
+          <w:highlight w:val="cyan"/>
+          <w:lang w:val="en-IN"/>
+        </w:rPr>
+        <w:t>authentication(</w:t>
+      </w:r>
+      <w:proofErr w:type="gramEnd"/>
+      <w:r>
+        <w:rPr>
+          <w:highlight w:val="cyan"/>
+          <w:lang w:val="en-IN"/>
+        </w:rPr>
+        <w:t>that Is sending username password for each request) but basic auth will work even if we delete the session that get created</w:t>
+      </w:r>
+    </w:p>
+    <w:p>
+      <w:pPr>
+        <w:rPr>
+          <w:lang w:val="en-IN"/>
+        </w:rPr>
+      </w:pPr>
+    </w:p>
+    <w:p>
+      <w:pPr>
+        <w:rPr>
+          <w:lang w:val="en-IN"/>
+        </w:rPr>
+      </w:pPr>
+    </w:p>
+    <w:p>
+      <w:pPr>
+        <w:rPr>
+          <w:highlight w:val="cyan"/>
+          <w:lang w:val="en-IN"/>
+        </w:rPr>
+      </w:pPr>
+      <w:r>
+        <w:rPr>
+          <w:highlight w:val="cyan"/>
+          <w:lang w:val="en-IN"/>
+        </w:rPr>
+        <w:t>“@</w:t>
+      </w:r>
+      <w:proofErr w:type="gramStart"/>
+      <w:r>
+        <w:rPr>
+          <w:highlight w:val="cyan"/>
+          <w:lang w:val="en-IN"/>
+        </w:rPr>
+        <w:t>EnableWebSecurity(</w:t>
+      </w:r>
+      <w:proofErr w:type="gramEnd"/>
+      <w:r>
+        <w:rPr>
+          <w:highlight w:val="cyan"/>
+          <w:lang w:val="en-IN"/>
+        </w:rPr>
+        <w:t xml:space="preserve">debug = true)” this along with adding in system property “logging.level.org.springframework.security=DEBUG” will allow us to show in the console all security filter used </w:t>
       </w:r>
     </w:p>
     <w:p>
@@ -1199,7 +1500,23 @@
           <w:highlight w:val="cyan"/>
           <w:lang w:val="en-IN"/>
         </w:rPr>
-        <w:t xml:space="preserve">To create a custom filter implement Filter or extend either </w:t>
+        <w:t xml:space="preserve">To create a custom </w:t>
+      </w:r>
+      <w:proofErr w:type="gramStart"/>
+      <w:r>
+        <w:rPr>
+          <w:highlight w:val="cyan"/>
+          <w:lang w:val="en-IN"/>
+        </w:rPr>
+        <w:t>filter</w:t>
+      </w:r>
+      <w:proofErr w:type="gramEnd"/>
+      <w:r>
+        <w:rPr>
+          <w:highlight w:val="cyan"/>
+          <w:lang w:val="en-IN"/>
+        </w:rPr>
+        <w:t xml:space="preserve"> implement Filter or extend either </w:t>
       </w:r>
       <w:r>
         <w:rPr>
@@ -1283,20 +1600,48 @@
         <w:rPr>
           <w:lang w:val="en-IN"/>
         </w:rPr>
-        <w:t>opaque token-There is no meaning for the string generated and to validate the token sent by client it must access server (auth server).  example (session based token)</w:t>
-      </w:r>
-    </w:p>
-    <w:p>
-      <w:pPr>
-        <w:rPr>
-          <w:lang w:val="en-IN"/>
-        </w:rPr>
-      </w:pPr>
-      <w:r>
-        <w:rPr>
-          <w:lang w:val="en-IN"/>
-        </w:rPr>
-        <w:t>jwt token-It contains meaning (userdetails,expirydate etc) to validate no need to sent token to auth server</w:t>
+        <w:t>opaque token-There is no meaning for the string generated and to validate the token sent by client it must access server (auth server).  example (</w:t>
+      </w:r>
+      <w:proofErr w:type="gramStart"/>
+      <w:r>
+        <w:rPr>
+          <w:lang w:val="en-IN"/>
+        </w:rPr>
+        <w:t>session based</w:t>
+      </w:r>
+      <w:proofErr w:type="gramEnd"/>
+      <w:r>
+        <w:rPr>
+          <w:lang w:val="en-IN"/>
+        </w:rPr>
+        <w:t xml:space="preserve"> token)</w:t>
+      </w:r>
+    </w:p>
+    <w:p>
+      <w:pPr>
+        <w:rPr>
+          <w:lang w:val="en-IN"/>
+        </w:rPr>
+      </w:pPr>
+      <w:r>
+        <w:rPr>
+          <w:lang w:val="en-IN"/>
+        </w:rPr>
+        <w:t>jwt token-It contains meaning (</w:t>
+      </w:r>
+      <w:proofErr w:type="gramStart"/>
+      <w:r>
+        <w:rPr>
+          <w:lang w:val="en-IN"/>
+        </w:rPr>
+        <w:t>userdetails,expirydate</w:t>
+      </w:r>
+      <w:proofErr w:type="gramEnd"/>
+      <w:r>
+        <w:rPr>
+          <w:lang w:val="en-IN"/>
+        </w:rPr>
+        <w:t xml:space="preserve"> etc) to validate no need to sent token to auth server</w:t>
       </w:r>
     </w:p>
     <w:p>
@@ -1339,7 +1684,21 @@
         <w:rPr>
           <w:lang w:val="en-IN"/>
         </w:rPr>
-        <w:t xml:space="preserve"> bascially in a jwt we have header,payload,signature, here we are getting details in the payload</w:t>
+        <w:t xml:space="preserve"> bascially in a jwt we have </w:t>
+      </w:r>
+      <w:proofErr w:type="gramStart"/>
+      <w:r>
+        <w:rPr>
+          <w:lang w:val="en-IN"/>
+        </w:rPr>
+        <w:t>header,payload</w:t>
+      </w:r>
+      <w:proofErr w:type="gramEnd"/>
+      <w:r>
+        <w:rPr>
+          <w:lang w:val="en-IN"/>
+        </w:rPr>
+        <w:t>,signature, here we are getting details in the payload</w:t>
       </w:r>
     </w:p>
     <w:p>
@@ -1756,7 +2115,21 @@
         <w:rPr>
           <w:lang w:val="en-IN"/>
         </w:rPr>
-        <w:t>- sits over Oauth to do authentication (but people now uses Oauth for authentication using sso)</w:t>
+        <w:t xml:space="preserve">- sits over Oauth to do authentication (but people now </w:t>
+      </w:r>
+      <w:proofErr w:type="gramStart"/>
+      <w:r>
+        <w:rPr>
+          <w:lang w:val="en-IN"/>
+        </w:rPr>
+        <w:t>uses</w:t>
+      </w:r>
+      <w:proofErr w:type="gramEnd"/>
+      <w:r>
+        <w:rPr>
+          <w:lang w:val="en-IN"/>
+        </w:rPr>
+        <w:t xml:space="preserve"> Oauth for authentication using sso)</w:t>
       </w:r>
     </w:p>
     <w:p>
@@ -2112,6 +2485,106 @@
         </w:rPr>
         <w:t>etc.</w:t>
       </w:r>
+    </w:p>
+    <w:p>
+      <w:pPr>
+        <w:rPr>
+          <w:lang w:val="en-IN"/>
+        </w:rPr>
+      </w:pPr>
+    </w:p>
+    <w:p>
+      <w:pPr>
+        <w:rPr>
+          <w:lang w:val="en-IN"/>
+        </w:rPr>
+      </w:pPr>
+      <w:r>
+        <w:rPr>
+          <w:lang w:val="en-IN"/>
+        </w:rPr>
+        <w:t xml:space="preserve">In keyclock we can easily say what should be the password be like uppercase letter 1 etc </w:t>
+      </w:r>
+    </w:p>
+    <w:p>
+      <w:pPr>
+        <w:rPr>
+          <w:lang w:val="en-IN"/>
+        </w:rPr>
+      </w:pPr>
+    </w:p>
+    <w:p>
+      <w:pPr>
+        <w:rPr>
+          <w:lang w:val="en-IN"/>
+        </w:rPr>
+      </w:pPr>
+      <w:r>
+        <w:rPr>
+          <w:lang w:val="en-IN"/>
+        </w:rPr>
+        <w:t xml:space="preserve">MFA also can be setuped easily </w:t>
+      </w:r>
+    </w:p>
+    <w:p>
+      <w:pPr>
+        <w:rPr>
+          <w:lang w:val="en-IN"/>
+        </w:rPr>
+      </w:pPr>
+    </w:p>
+    <w:p>
+      <w:pPr>
+        <w:rPr>
+          <w:lang w:val="en-IN"/>
+        </w:rPr>
+      </w:pPr>
+      <w:r>
+        <w:rPr>
+          <w:lang w:val="en-IN"/>
+        </w:rPr>
+        <w:t xml:space="preserve">If we want to add social </w:t>
+      </w:r>
+      <w:proofErr w:type="gramStart"/>
+      <w:r>
+        <w:rPr>
+          <w:lang w:val="en-IN"/>
+        </w:rPr>
+        <w:t>logins</w:t>
+      </w:r>
+      <w:proofErr w:type="gramEnd"/>
+      <w:r>
+        <w:rPr>
+          <w:lang w:val="en-IN"/>
+        </w:rPr>
+        <w:t xml:space="preserve"> we call also add that using keyclock going to identity provider </w:t>
+      </w:r>
+      <w:r>
+        <w:rPr>
+          <w:lang w:val="en-IN"/>
+        </w:rPr>
+        <w:t>and those user that we access from sso a local record is created in user table of ketclock</w:t>
+      </w:r>
+      <w:r>
+        <w:rPr>
+          <w:lang w:val="en-IN"/>
+        </w:rPr>
+        <w:br w:type="page"/>
+      </w:r>
+    </w:p>
+    <w:p>
+      <w:pPr>
+        <w:rPr>
+          <w:lang w:val="en-IN"/>
+        </w:rPr>
+      </w:pPr>
+    </w:p>
+    <w:p>
+      <w:pPr>
+        <w:rPr>
+          <w:lang w:val="en-IN"/>
+        </w:rPr>
+      </w:pPr>
     </w:p>
     <w:p>
       <w:pPr>

</xml_diff>

<commit_message>
Created custom auth server also made update to resourse server to now consider this newly created auth server (for that just update application property thats all)
</commit_message>
<xml_diff>
--- a/Important things.docx
+++ b/Important things.docx
@@ -17,16 +17,21 @@
     </w:p>
     <w:p>
       <w:r>
-        <w:t xml:space="preserve">(securityfilter chain -&gt; Authentication Manager (Authenticate) -&gt; Authentication </w:t>
-      </w:r>
-      <w:proofErr w:type="gramStart"/>
-      <w:r>
-        <w:t>provider(</w:t>
-      </w:r>
-      <w:proofErr w:type="gramEnd"/>
+        <w:t>(</w:t>
+      </w:r>
+      <w:proofErr w:type="spellStart"/>
+      <w:r>
+        <w:t>securityfilter</w:t>
+      </w:r>
+      <w:proofErr w:type="spellEnd"/>
+      <w:r>
+        <w:t xml:space="preserve"> chain -&gt; Authentication Manager (Authenticate) -&gt; Authentication provider(</w:t>
+      </w:r>
+      <w:proofErr w:type="spellStart"/>
       <w:r>
         <w:t>DOAautheticationProvider</w:t>
       </w:r>
+      <w:proofErr w:type="spellEnd"/>
       <w:r>
         <w:rPr>
           <w:lang w:val="en-IN"/>
@@ -34,17 +39,64 @@
         <w:t xml:space="preserve"> not just this, this one is default we can create custom</w:t>
       </w:r>
       <w:r>
-        <w:t>) -&gt; Fetch user detail either to login (UserDetailService (loadUserByUserName)) or to create update login etc (UserDetailmANGER (InmemoryuserDetailManager and JDBCuserDetailManager</w:t>
-      </w:r>
+        <w:t>) -&gt; Fetch user detail either to login (</w:t>
+      </w:r>
+      <w:proofErr w:type="spellStart"/>
+      <w:r>
+        <w:t>UserDetailService</w:t>
+      </w:r>
+      <w:proofErr w:type="spellEnd"/>
+      <w:r>
+        <w:t xml:space="preserve"> (</w:t>
+      </w:r>
+      <w:proofErr w:type="spellStart"/>
+      <w:r>
+        <w:t>loadUserByUserName</w:t>
+      </w:r>
+      <w:proofErr w:type="spellEnd"/>
+      <w:r>
+        <w:t xml:space="preserve">)) or to create update login </w:t>
+      </w:r>
+      <w:proofErr w:type="spellStart"/>
+      <w:r>
+        <w:t>etc</w:t>
+      </w:r>
+      <w:proofErr w:type="spellEnd"/>
+      <w:r>
+        <w:t xml:space="preserve"> (</w:t>
+      </w:r>
+      <w:proofErr w:type="spellStart"/>
+      <w:r>
+        <w:t>UserDetailmANGER</w:t>
+      </w:r>
+      <w:proofErr w:type="spellEnd"/>
+      <w:r>
+        <w:t xml:space="preserve"> (</w:t>
+      </w:r>
+      <w:proofErr w:type="spellStart"/>
+      <w:r>
+        <w:t>InmemoryuserDetailManager</w:t>
+      </w:r>
+      <w:proofErr w:type="spellEnd"/>
+      <w:r>
+        <w:t xml:space="preserve"> and </w:t>
+      </w:r>
+      <w:proofErr w:type="spellStart"/>
+      <w:r>
+        <w:t>JDBCuserDetailManager</w:t>
+      </w:r>
+      <w:proofErr w:type="spellEnd"/>
       <w:r>
         <w:rPr>
           <w:lang w:val="en-IN"/>
         </w:rPr>
         <w:t xml:space="preserve"> this also calls </w:t>
       </w:r>
+      <w:proofErr w:type="spellStart"/>
       <w:r>
         <w:t>loadUserByUserName</w:t>
       </w:r>
+      <w:proofErr w:type="spellEnd"/>
       <w:r>
         <w:rPr>
           <w:lang w:val="en-IN"/>
@@ -58,7 +110,15 @@
     <w:p/>
     <w:p>
       <w:r>
-        <w:t>All the above comes under authentication and authorized is checking roles if the authenticated user can acces these links</w:t>
+        <w:t xml:space="preserve">All the above comes under authentication and authorized is checking roles if the authenticated user can </w:t>
+      </w:r>
+      <w:proofErr w:type="spellStart"/>
+      <w:r>
+        <w:t>acces</w:t>
+      </w:r>
+      <w:proofErr w:type="spellEnd"/>
+      <w:r>
+        <w:t xml:space="preserve"> these links</w:t>
       </w:r>
     </w:p>
     <w:p/>
@@ -74,7 +134,23 @@
           <w:highlight w:val="cyan"/>
           <w:lang w:val="en-IN"/>
         </w:rPr>
-        <w:t xml:space="preserve">If basicAutheitcation is on </w:t>
+        <w:t xml:space="preserve">If </w:t>
+      </w:r>
+      <w:proofErr w:type="spellStart"/>
+      <w:r>
+        <w:rPr>
+          <w:highlight w:val="cyan"/>
+          <w:lang w:val="en-IN"/>
+        </w:rPr>
+        <w:t>basicAutheitcation</w:t>
+      </w:r>
+      <w:proofErr w:type="spellEnd"/>
+      <w:r>
+        <w:rPr>
+          <w:highlight w:val="cyan"/>
+          <w:lang w:val="en-IN"/>
+        </w:rPr>
+        <w:t xml:space="preserve"> is on </w:t>
       </w:r>
     </w:p>
     <w:p/>
@@ -88,100 +164,258 @@
         <w:rPr>
           <w:lang w:val="en-IN"/>
         </w:rPr>
-        <w:t>We have to send data in header as Authorization: basic (Enocoded value of username and pasword) from frontend and this is taken by basicAutheticationFilter and rest it will do (calls default authetication manager and then authentication provider</w:t>
-      </w:r>
-      <w:proofErr w:type="gramStart"/>
-      <w:r>
-        <w:rPr>
-          <w:lang w:val="en-IN"/>
-        </w:rPr>
-        <w:t>).For</w:t>
-      </w:r>
-      <w:proofErr w:type="gramEnd"/>
-      <w:r>
-        <w:rPr>
-          <w:lang w:val="en-IN"/>
-        </w:rPr>
-        <w:t xml:space="preserve"> subsequent calls also we need to sent in header the Authorization: basic (Enocoded value of username and pasword) </w:t>
-      </w:r>
-    </w:p>
-    <w:p>
-      <w:pPr>
-        <w:rPr>
-          <w:lang w:val="en-IN"/>
-        </w:rPr>
-      </w:pPr>
-    </w:p>
-    <w:p>
-      <w:pPr>
-        <w:rPr>
-          <w:highlight w:val="cyan"/>
-          <w:lang w:val="en-IN"/>
-        </w:rPr>
-      </w:pPr>
-      <w:r>
-        <w:rPr>
-          <w:highlight w:val="cyan"/>
-          <w:lang w:val="en-IN"/>
-        </w:rPr>
-        <w:t>If Formlogin is on and we want it to be used</w:t>
-      </w:r>
-    </w:p>
-    <w:p>
-      <w:pPr>
-        <w:rPr>
-          <w:highlight w:val="cyan"/>
-          <w:lang w:val="en-IN"/>
-        </w:rPr>
-      </w:pPr>
-    </w:p>
-    <w:p>
-      <w:pPr>
-        <w:rPr>
-          <w:lang w:val="en-IN"/>
-        </w:rPr>
-      </w:pPr>
-      <w:r>
-        <w:rPr>
-          <w:lang w:val="en-IN"/>
-        </w:rPr>
-        <w:t xml:space="preserve">To use that from frontend we have to sent data to /login default page (no need to mention anywhere spring knows it) when we send data it should be of the form “x-www-form-urlenocoded” format not in json format and it is then intercepted by UserNamePasswordAuthenticationFilter and rest it will do. Subsequent calls there is no need to do anything browser will automatically </w:t>
-      </w:r>
-      <w:proofErr w:type="gramStart"/>
+        <w:t>We have to send data in header as Authorization: basic (</w:t>
+      </w:r>
+      <w:proofErr w:type="spellStart"/>
+      <w:r>
+        <w:rPr>
+          <w:lang w:val="en-IN"/>
+        </w:rPr>
+        <w:t>Enocoded</w:t>
+      </w:r>
+      <w:proofErr w:type="spellEnd"/>
+      <w:r>
+        <w:rPr>
+          <w:lang w:val="en-IN"/>
+        </w:rPr>
+        <w:t xml:space="preserve"> value of username and </w:t>
+      </w:r>
+      <w:proofErr w:type="spellStart"/>
+      <w:r>
+        <w:rPr>
+          <w:lang w:val="en-IN"/>
+        </w:rPr>
+        <w:t>pasword</w:t>
+      </w:r>
+      <w:proofErr w:type="spellEnd"/>
+      <w:r>
+        <w:rPr>
+          <w:lang w:val="en-IN"/>
+        </w:rPr>
+        <w:t xml:space="preserve">) from frontend and this is taken by </w:t>
+      </w:r>
+      <w:proofErr w:type="spellStart"/>
+      <w:r>
+        <w:rPr>
+          <w:lang w:val="en-IN"/>
+        </w:rPr>
+        <w:t>basicAutheticationFilter</w:t>
+      </w:r>
+      <w:proofErr w:type="spellEnd"/>
+      <w:r>
+        <w:rPr>
+          <w:lang w:val="en-IN"/>
+        </w:rPr>
+        <w:t xml:space="preserve"> and rest it will do (calls default </w:t>
+      </w:r>
+      <w:proofErr w:type="spellStart"/>
+      <w:r>
+        <w:rPr>
+          <w:lang w:val="en-IN"/>
+        </w:rPr>
+        <w:t>authetication</w:t>
+      </w:r>
+      <w:proofErr w:type="spellEnd"/>
+      <w:r>
+        <w:rPr>
+          <w:lang w:val="en-IN"/>
+        </w:rPr>
+        <w:t xml:space="preserve"> manager and then authentication provider).For subsequent calls also we need to </w:t>
+      </w:r>
+      <w:proofErr w:type="spellStart"/>
       <w:r>
         <w:rPr>
           <w:lang w:val="en-IN"/>
         </w:rPr>
         <w:t>sent</w:t>
       </w:r>
-      <w:proofErr w:type="gramEnd"/>
-      <w:r>
-        <w:rPr>
-          <w:lang w:val="en-IN"/>
-        </w:rPr>
-        <w:t xml:space="preserve"> the cookie for authentication</w:t>
-      </w:r>
-    </w:p>
-    <w:p>
-      <w:pPr>
-        <w:rPr>
-          <w:lang w:val="en-IN"/>
-        </w:rPr>
-      </w:pPr>
-    </w:p>
-    <w:p>
-      <w:pPr>
-        <w:rPr>
-          <w:highlight w:val="cyan"/>
-          <w:lang w:val="en-IN"/>
-        </w:rPr>
-      </w:pPr>
-      <w:r>
-        <w:rPr>
-          <w:highlight w:val="cyan"/>
-          <w:lang w:val="en-IN"/>
-        </w:rPr>
-        <w:t>If we don’t use both way and create custom /login controller then we have to create our own authentication manager and do the authentication manually (we can also if needed create and call custom authetication provider)</w:t>
+      <w:proofErr w:type="spellEnd"/>
+      <w:r>
+        <w:rPr>
+          <w:lang w:val="en-IN"/>
+        </w:rPr>
+        <w:t xml:space="preserve"> in header the Authorization: basic (</w:t>
+      </w:r>
+      <w:proofErr w:type="spellStart"/>
+      <w:r>
+        <w:rPr>
+          <w:lang w:val="en-IN"/>
+        </w:rPr>
+        <w:t>Enocoded</w:t>
+      </w:r>
+      <w:proofErr w:type="spellEnd"/>
+      <w:r>
+        <w:rPr>
+          <w:lang w:val="en-IN"/>
+        </w:rPr>
+        <w:t xml:space="preserve"> value of username and </w:t>
+      </w:r>
+      <w:proofErr w:type="spellStart"/>
+      <w:r>
+        <w:rPr>
+          <w:lang w:val="en-IN"/>
+        </w:rPr>
+        <w:t>pasword</w:t>
+      </w:r>
+      <w:proofErr w:type="spellEnd"/>
+      <w:r>
+        <w:rPr>
+          <w:lang w:val="en-IN"/>
+        </w:rPr>
+        <w:t xml:space="preserve">) </w:t>
+      </w:r>
+    </w:p>
+    <w:p>
+      <w:pPr>
+        <w:rPr>
+          <w:lang w:val="en-IN"/>
+        </w:rPr>
+      </w:pPr>
+    </w:p>
+    <w:p>
+      <w:pPr>
+        <w:rPr>
+          <w:highlight w:val="cyan"/>
+          <w:lang w:val="en-IN"/>
+        </w:rPr>
+      </w:pPr>
+      <w:r>
+        <w:rPr>
+          <w:highlight w:val="cyan"/>
+          <w:lang w:val="en-IN"/>
+        </w:rPr>
+        <w:t xml:space="preserve">If </w:t>
+      </w:r>
+      <w:proofErr w:type="spellStart"/>
+      <w:r>
+        <w:rPr>
+          <w:highlight w:val="cyan"/>
+          <w:lang w:val="en-IN"/>
+        </w:rPr>
+        <w:t>Formlogin</w:t>
+      </w:r>
+      <w:proofErr w:type="spellEnd"/>
+      <w:r>
+        <w:rPr>
+          <w:highlight w:val="cyan"/>
+          <w:lang w:val="en-IN"/>
+        </w:rPr>
+        <w:t xml:space="preserve"> is on and we want it to be used</w:t>
+      </w:r>
+    </w:p>
+    <w:p>
+      <w:pPr>
+        <w:rPr>
+          <w:highlight w:val="cyan"/>
+          <w:lang w:val="en-IN"/>
+        </w:rPr>
+      </w:pPr>
+    </w:p>
+    <w:p>
+      <w:pPr>
+        <w:rPr>
+          <w:lang w:val="en-IN"/>
+        </w:rPr>
+      </w:pPr>
+      <w:r>
+        <w:rPr>
+          <w:lang w:val="en-IN"/>
+        </w:rPr>
+        <w:t xml:space="preserve">To use that from frontend we have to </w:t>
+      </w:r>
+      <w:proofErr w:type="spellStart"/>
+      <w:r>
+        <w:rPr>
+          <w:lang w:val="en-IN"/>
+        </w:rPr>
+        <w:t>sent</w:t>
+      </w:r>
+      <w:proofErr w:type="spellEnd"/>
+      <w:r>
+        <w:rPr>
+          <w:lang w:val="en-IN"/>
+        </w:rPr>
+        <w:t xml:space="preserve"> data to /login default page (no need to mention anywhere spring knows it) when we send data it should be of the form “x-www-form-</w:t>
+      </w:r>
+      <w:proofErr w:type="spellStart"/>
+      <w:r>
+        <w:rPr>
+          <w:lang w:val="en-IN"/>
+        </w:rPr>
+        <w:t>urlenocoded</w:t>
+      </w:r>
+      <w:proofErr w:type="spellEnd"/>
+      <w:r>
+        <w:rPr>
+          <w:lang w:val="en-IN"/>
+        </w:rPr>
+        <w:t xml:space="preserve">” format not in </w:t>
+      </w:r>
+      <w:proofErr w:type="spellStart"/>
+      <w:r>
+        <w:rPr>
+          <w:lang w:val="en-IN"/>
+        </w:rPr>
+        <w:t>json</w:t>
+      </w:r>
+      <w:proofErr w:type="spellEnd"/>
+      <w:r>
+        <w:rPr>
+          <w:lang w:val="en-IN"/>
+        </w:rPr>
+        <w:t xml:space="preserve"> format and it is then intercepted by </w:t>
+      </w:r>
+      <w:proofErr w:type="spellStart"/>
+      <w:r>
+        <w:rPr>
+          <w:lang w:val="en-IN"/>
+        </w:rPr>
+        <w:t>UserNamePasswordAuthenticationFilter</w:t>
+      </w:r>
+      <w:proofErr w:type="spellEnd"/>
+      <w:r>
+        <w:rPr>
+          <w:lang w:val="en-IN"/>
+        </w:rPr>
+        <w:t xml:space="preserve"> and rest it will do. Subsequent calls there is no need to do anything browser will automatically sent the cookie for authentication</w:t>
+      </w:r>
+    </w:p>
+    <w:p>
+      <w:pPr>
+        <w:rPr>
+          <w:lang w:val="en-IN"/>
+        </w:rPr>
+      </w:pPr>
+    </w:p>
+    <w:p>
+      <w:pPr>
+        <w:rPr>
+          <w:highlight w:val="cyan"/>
+          <w:lang w:val="en-IN"/>
+        </w:rPr>
+      </w:pPr>
+      <w:r>
+        <w:rPr>
+          <w:highlight w:val="cyan"/>
+          <w:lang w:val="en-IN"/>
+        </w:rPr>
+        <w:t xml:space="preserve">If we don’t use both way and create custom /login controller then we have to create our own authentication manager and do the authentication manually (we can also if needed create and call custom </w:t>
+      </w:r>
+      <w:proofErr w:type="spellStart"/>
+      <w:r>
+        <w:rPr>
+          <w:highlight w:val="cyan"/>
+          <w:lang w:val="en-IN"/>
+        </w:rPr>
+        <w:t>authetication</w:t>
+      </w:r>
+      <w:proofErr w:type="spellEnd"/>
+      <w:r>
+        <w:rPr>
+          <w:highlight w:val="cyan"/>
+          <w:lang w:val="en-IN"/>
+        </w:rPr>
+        <w:t xml:space="preserve"> provider)</w:t>
       </w:r>
     </w:p>
     <w:p/>
@@ -195,8 +429,16 @@
         <w:rPr>
           <w:highlight w:val="cyan"/>
         </w:rPr>
-        <w:t>What is filter and servelet</w:t>
-      </w:r>
+        <w:t xml:space="preserve">What is filter and </w:t>
+      </w:r>
+      <w:proofErr w:type="spellStart"/>
+      <w:r>
+        <w:rPr>
+          <w:highlight w:val="cyan"/>
+        </w:rPr>
+        <w:t>servelet</w:t>
+      </w:r>
+      <w:proofErr w:type="spellEnd"/>
     </w:p>
     <w:p/>
     <w:p>
@@ -207,27 +449,67 @@
         <w:t>Authentication</w:t>
       </w:r>
       <w:r>
-        <w:t xml:space="preserve"> (the object that daoAuthenticationProvider return this is used once autheticated) and also </w:t>
-      </w:r>
-      <w:r>
-        <w:rPr>
-          <w:highlight w:val="cyan"/>
-        </w:rPr>
-        <w:t>userdetail differce</w:t>
-      </w:r>
+        <w:t xml:space="preserve"> (the object that </w:t>
+      </w:r>
+      <w:proofErr w:type="spellStart"/>
+      <w:r>
+        <w:t>daoAuthenticationProvider</w:t>
+      </w:r>
+      <w:proofErr w:type="spellEnd"/>
+      <w:r>
+        <w:t xml:space="preserve"> return this is used once </w:t>
+      </w:r>
+      <w:proofErr w:type="spellStart"/>
+      <w:r>
+        <w:t>autheticated</w:t>
+      </w:r>
+      <w:proofErr w:type="spellEnd"/>
+      <w:r>
+        <w:t xml:space="preserve">) and also </w:t>
+      </w:r>
+      <w:proofErr w:type="spellStart"/>
+      <w:r>
+        <w:rPr>
+          <w:highlight w:val="cyan"/>
+        </w:rPr>
+        <w:t>userdetail</w:t>
+      </w:r>
+      <w:proofErr w:type="spellEnd"/>
+      <w:r>
+        <w:rPr>
+          <w:highlight w:val="cyan"/>
+        </w:rPr>
+        <w:t xml:space="preserve"> </w:t>
+      </w:r>
+      <w:proofErr w:type="spellStart"/>
+      <w:r>
+        <w:rPr>
+          <w:highlight w:val="cyan"/>
+        </w:rPr>
+        <w:t>differce</w:t>
+      </w:r>
+      <w:proofErr w:type="spellEnd"/>
       <w:r>
         <w:t xml:space="preserve"> (this is used when we fetch data from database)</w:t>
       </w:r>
     </w:p>
     <w:p/>
     <w:p>
-      <w:r>
-        <w:rPr>
-          <w:highlight w:val="cyan"/>
-        </w:rPr>
-        <w:t xml:space="preserve">Differnce between </w:t>
-      </w:r>
-      <w:proofErr w:type="gramStart"/>
+      <w:proofErr w:type="spellStart"/>
+      <w:r>
+        <w:rPr>
+          <w:highlight w:val="cyan"/>
+        </w:rPr>
+        <w:t>Differnce</w:t>
+      </w:r>
+      <w:proofErr w:type="spellEnd"/>
+      <w:r>
+        <w:rPr>
+          <w:highlight w:val="cyan"/>
+        </w:rPr>
+        <w:t xml:space="preserve"> between </w:t>
+      </w:r>
+      <w:proofErr w:type="spellStart"/>
       <w:r>
         <w:rPr>
           <w:highlight w:val="cyan"/>
@@ -235,20 +517,68 @@
         <w:t>userDetailManage</w:t>
       </w:r>
       <w:r>
-        <w:t>r(</w:t>
-      </w:r>
-      <w:proofErr w:type="gramEnd"/>
-      <w:r>
-        <w:t xml:space="preserve">to create user,delete,update etc like the InmemoryuserDetailManager and JDBCuserDetailManager) </w:t>
-      </w:r>
-      <w:r>
-        <w:rPr>
-          <w:highlight w:val="cyan"/>
-        </w:rPr>
-        <w:t>and UserDetailService</w:t>
-      </w:r>
-      <w:r>
-        <w:t>(it has function loadUserByUserName this is used to authenticate the logged in user)</w:t>
+        <w:t>r</w:t>
+      </w:r>
+      <w:proofErr w:type="spellEnd"/>
+      <w:r>
+        <w:t xml:space="preserve">(to create </w:t>
+      </w:r>
+      <w:proofErr w:type="spellStart"/>
+      <w:r>
+        <w:t>user,delete,update</w:t>
+      </w:r>
+      <w:proofErr w:type="spellEnd"/>
+      <w:r>
+        <w:t xml:space="preserve"> </w:t>
+      </w:r>
+      <w:proofErr w:type="spellStart"/>
+      <w:r>
+        <w:t>etc</w:t>
+      </w:r>
+      <w:proofErr w:type="spellEnd"/>
+      <w:r>
+        <w:t xml:space="preserve"> like the </w:t>
+      </w:r>
+      <w:proofErr w:type="spellStart"/>
+      <w:r>
+        <w:t>InmemoryuserDetailManager</w:t>
+      </w:r>
+      <w:proofErr w:type="spellEnd"/>
+      <w:r>
+        <w:t xml:space="preserve"> and </w:t>
+      </w:r>
+      <w:proofErr w:type="spellStart"/>
+      <w:r>
+        <w:t>JDBCuserDetailManager</w:t>
+      </w:r>
+      <w:proofErr w:type="spellEnd"/>
+      <w:r>
+        <w:t xml:space="preserve">) </w:t>
+      </w:r>
+      <w:r>
+        <w:rPr>
+          <w:highlight w:val="cyan"/>
+        </w:rPr>
+        <w:t xml:space="preserve">and </w:t>
+      </w:r>
+      <w:proofErr w:type="spellStart"/>
+      <w:r>
+        <w:rPr>
+          <w:highlight w:val="cyan"/>
+        </w:rPr>
+        <w:t>UserDetailService</w:t>
+      </w:r>
+      <w:proofErr w:type="spellEnd"/>
+      <w:r>
+        <w:t xml:space="preserve">(it has function </w:t>
+      </w:r>
+      <w:proofErr w:type="spellStart"/>
+      <w:r>
+        <w:t>loadUserByUserName</w:t>
+      </w:r>
+      <w:proofErr w:type="spellEnd"/>
+      <w:r>
+        <w:t xml:space="preserve"> this is used to authenticate the logged in user)</w:t>
       </w:r>
     </w:p>
     <w:p/>
@@ -307,8 +637,13 @@
       </w:r>
     </w:p>
     <w:p>
-      <w:r>
-        <w:t>AbstractAuthenticationToken (abstract)</w:t>
+      <w:proofErr w:type="spellStart"/>
+      <w:r>
+        <w:t>AbstractAuthenticationToken</w:t>
+      </w:r>
+      <w:proofErr w:type="spellEnd"/>
+      <w:r>
+        <w:t xml:space="preserve"> (abstract)</w:t>
       </w:r>
     </w:p>
     <w:p>
@@ -317,9 +652,11 @@
       </w:r>
     </w:p>
     <w:p>
+      <w:proofErr w:type="spellStart"/>
       <w:r>
         <w:t>UsernamePasswordAuthenticationToken</w:t>
       </w:r>
+      <w:proofErr w:type="spellEnd"/>
     </w:p>
     <w:p>
       <w:r>
@@ -327,13 +664,23 @@
       </w:r>
     </w:p>
     <w:p>
-      <w:r>
-        <w:t>AbstractAuthenticationToken implements common methods.</w:t>
-      </w:r>
-    </w:p>
-    <w:p>
-      <w:r>
-        <w:t>UsernamePasswordAuthenticationToken implements the methods left by the parent.</w:t>
+      <w:proofErr w:type="spellStart"/>
+      <w:r>
+        <w:t>AbstractAuthenticationToken</w:t>
+      </w:r>
+      <w:proofErr w:type="spellEnd"/>
+      <w:r>
+        <w:t xml:space="preserve"> implements common methods.</w:t>
+      </w:r>
+    </w:p>
+    <w:p>
+      <w:proofErr w:type="spellStart"/>
+      <w:r>
+        <w:t>UsernamePasswordAuthenticationToken</w:t>
+      </w:r>
+      <w:proofErr w:type="spellEnd"/>
+      <w:r>
+        <w:t xml:space="preserve"> implements the methods left by the parent.</w:t>
       </w:r>
     </w:p>
     <w:p/>
@@ -349,23 +696,7 @@
           <w:highlight w:val="cyan"/>
           <w:lang w:val="en-IN"/>
         </w:rPr>
-        <w:t xml:space="preserve">Using </w:t>
-      </w:r>
-      <w:proofErr w:type="gramStart"/>
-      <w:r>
-        <w:rPr>
-          <w:highlight w:val="cyan"/>
-          <w:lang w:val="en-IN"/>
-        </w:rPr>
-        <w:t>Interface</w:t>
-      </w:r>
-      <w:proofErr w:type="gramEnd"/>
-      <w:r>
-        <w:rPr>
-          <w:highlight w:val="cyan"/>
-          <w:lang w:val="en-IN"/>
-        </w:rPr>
-        <w:t xml:space="preserve"> we can call the object with parent name</w:t>
+        <w:t>Using Interface we can call the object with parent name</w:t>
       </w:r>
     </w:p>
     <w:p/>
@@ -377,15 +708,15 @@
     </w:p>
     <w:p>
       <w:r>
-        <w:t xml:space="preserve">Animal animal = new </w:t>
-      </w:r>
-      <w:proofErr w:type="gramStart"/>
-      <w:r>
-        <w:t>Dog(</w:t>
-      </w:r>
-      <w:proofErr w:type="gramEnd"/>
-      <w:r>
-        <w:t>);</w:t>
+        <w:t xml:space="preserve">Animal </w:t>
+      </w:r>
+      <w:proofErr w:type="spellStart"/>
+      <w:r>
+        <w:t>animal</w:t>
+      </w:r>
+      <w:proofErr w:type="spellEnd"/>
+      <w:r>
+        <w:t xml:space="preserve"> = new Dog();</w:t>
       </w:r>
     </w:p>
     <w:p>
@@ -402,6 +733,7 @@
           <w:lang w:val="en-IN"/>
         </w:rPr>
       </w:pPr>
+      <w:proofErr w:type="spellStart"/>
       <w:r>
         <w:rPr>
           <w:highlight w:val="cyan"/>
@@ -409,87 +741,158 @@
         </w:rPr>
         <w:t>JpaRepository</w:t>
       </w:r>
-    </w:p>
-    <w:p>
-      <w:pPr>
-        <w:rPr>
-          <w:highlight w:val="cyan"/>
-          <w:lang w:val="en-IN"/>
-        </w:rPr>
-      </w:pPr>
-    </w:p>
-    <w:p>
-      <w:pPr>
-        <w:rPr>
-          <w:lang w:val="en-IN"/>
-        </w:rPr>
-      </w:pPr>
-      <w:r>
-        <w:rPr>
-          <w:lang w:val="en-IN"/>
-        </w:rPr>
-        <w:t xml:space="preserve">Normally when we use jpaRepositoy for doing database action by default we have </w:t>
-      </w:r>
-      <w:proofErr w:type="gramStart"/>
+      <w:proofErr w:type="spellEnd"/>
+    </w:p>
+    <w:p>
+      <w:pPr>
+        <w:rPr>
+          <w:highlight w:val="cyan"/>
+          <w:lang w:val="en-IN"/>
+        </w:rPr>
+      </w:pPr>
+    </w:p>
+    <w:p>
+      <w:pPr>
+        <w:rPr>
+          <w:lang w:val="en-IN"/>
+        </w:rPr>
+      </w:pPr>
+      <w:r>
+        <w:rPr>
+          <w:lang w:val="en-IN"/>
+        </w:rPr>
+        <w:t xml:space="preserve">Normally when we use </w:t>
+      </w:r>
+      <w:proofErr w:type="spellStart"/>
+      <w:r>
+        <w:rPr>
+          <w:lang w:val="en-IN"/>
+        </w:rPr>
+        <w:t>jpaRepositoy</w:t>
+      </w:r>
+      <w:proofErr w:type="spellEnd"/>
+      <w:r>
+        <w:rPr>
+          <w:lang w:val="en-IN"/>
+        </w:rPr>
+        <w:t xml:space="preserve"> for doing database action by default we have </w:t>
+      </w:r>
+      <w:proofErr w:type="spellStart"/>
       <w:r>
         <w:rPr>
           <w:lang w:val="en-IN"/>
         </w:rPr>
         <w:t>findById,findAll</w:t>
       </w:r>
-      <w:proofErr w:type="gramEnd"/>
-      <w:r>
-        <w:rPr>
-          <w:lang w:val="en-IN"/>
-        </w:rPr>
-        <w:t xml:space="preserve"> etc we can also add custom methods in the interface no need to mention its content just mention function name and jpa will automatically understand and find the data. But we need to maintain some naming convention for it to understand like findByEmail so it </w:t>
-      </w:r>
-      <w:proofErr w:type="gramStart"/>
-      <w:r>
-        <w:rPr>
-          <w:lang w:val="en-IN"/>
-        </w:rPr>
-        <w:t>know</w:t>
-      </w:r>
-      <w:proofErr w:type="gramEnd"/>
-      <w:r>
-        <w:rPr>
-          <w:lang w:val="en-IN"/>
-        </w:rPr>
-        <w:t xml:space="preserve"> we need to find record with this given email</w:t>
-      </w:r>
-    </w:p>
-    <w:p>
-      <w:pPr>
-        <w:rPr>
-          <w:lang w:val="en-IN"/>
-        </w:rPr>
-      </w:pPr>
-    </w:p>
-    <w:p>
-      <w:pPr>
-        <w:rPr>
-          <w:lang w:val="en-IN"/>
-        </w:rPr>
-      </w:pPr>
-      <w:r>
-        <w:rPr>
-          <w:lang w:val="en-IN"/>
-        </w:rPr>
-        <w:t xml:space="preserve">We also have @Query where we can mention anything like the createQueryt in the otherone </w:t>
-      </w:r>
-    </w:p>
-    <w:p>
-      <w:pPr>
-        <w:rPr>
-          <w:lang w:val="en-IN"/>
-        </w:rPr>
-      </w:pPr>
-      <w:r>
-        <w:rPr>
-          <w:lang w:val="en-IN"/>
-        </w:rPr>
-        <w:t>Check project “spring security eazybank-backend”</w:t>
+      <w:proofErr w:type="spellEnd"/>
+      <w:r>
+        <w:rPr>
+          <w:lang w:val="en-IN"/>
+        </w:rPr>
+        <w:t xml:space="preserve"> etc we can also add custom methods in the interface no need to mention its content just mention function name and </w:t>
+      </w:r>
+      <w:proofErr w:type="spellStart"/>
+      <w:r>
+        <w:rPr>
+          <w:lang w:val="en-IN"/>
+        </w:rPr>
+        <w:t>jpa</w:t>
+      </w:r>
+      <w:proofErr w:type="spellEnd"/>
+      <w:r>
+        <w:rPr>
+          <w:lang w:val="en-IN"/>
+        </w:rPr>
+        <w:t xml:space="preserve"> will automatically understand and find the data. But we need to maintain some naming convention for it to understand like </w:t>
+      </w:r>
+      <w:proofErr w:type="spellStart"/>
+      <w:r>
+        <w:rPr>
+          <w:lang w:val="en-IN"/>
+        </w:rPr>
+        <w:t>findByEmail</w:t>
+      </w:r>
+      <w:proofErr w:type="spellEnd"/>
+      <w:r>
+        <w:rPr>
+          <w:lang w:val="en-IN"/>
+        </w:rPr>
+        <w:t xml:space="preserve"> so it know we need to find record with this given email</w:t>
+      </w:r>
+    </w:p>
+    <w:p>
+      <w:pPr>
+        <w:rPr>
+          <w:lang w:val="en-IN"/>
+        </w:rPr>
+      </w:pPr>
+    </w:p>
+    <w:p>
+      <w:pPr>
+        <w:rPr>
+          <w:lang w:val="en-IN"/>
+        </w:rPr>
+      </w:pPr>
+      <w:r>
+        <w:rPr>
+          <w:lang w:val="en-IN"/>
+        </w:rPr>
+        <w:t xml:space="preserve">We also have @Query where we can mention anything like the </w:t>
+      </w:r>
+      <w:proofErr w:type="spellStart"/>
+      <w:r>
+        <w:rPr>
+          <w:lang w:val="en-IN"/>
+        </w:rPr>
+        <w:t>createQueryt</w:t>
+      </w:r>
+      <w:proofErr w:type="spellEnd"/>
+      <w:r>
+        <w:rPr>
+          <w:lang w:val="en-IN"/>
+        </w:rPr>
+        <w:t xml:space="preserve"> in the </w:t>
+      </w:r>
+      <w:proofErr w:type="spellStart"/>
+      <w:r>
+        <w:rPr>
+          <w:lang w:val="en-IN"/>
+        </w:rPr>
+        <w:t>otherone</w:t>
+      </w:r>
+      <w:proofErr w:type="spellEnd"/>
+      <w:r>
+        <w:rPr>
+          <w:lang w:val="en-IN"/>
+        </w:rPr>
+        <w:t xml:space="preserve"> </w:t>
+      </w:r>
+    </w:p>
+    <w:p>
+      <w:pPr>
+        <w:rPr>
+          <w:lang w:val="en-IN"/>
+        </w:rPr>
+      </w:pPr>
+      <w:r>
+        <w:rPr>
+          <w:lang w:val="en-IN"/>
+        </w:rPr>
+        <w:t xml:space="preserve">Check project “spring security </w:t>
+      </w:r>
+      <w:proofErr w:type="spellStart"/>
+      <w:r>
+        <w:rPr>
+          <w:lang w:val="en-IN"/>
+        </w:rPr>
+        <w:t>eazybank</w:t>
+      </w:r>
+      <w:proofErr w:type="spellEnd"/>
+      <w:r>
+        <w:rPr>
+          <w:lang w:val="en-IN"/>
+        </w:rPr>
+        <w:t>-backend”</w:t>
       </w:r>
     </w:p>
     <w:p>
@@ -539,21 +942,77 @@
         <w:rPr>
           <w:lang w:val="en-IN"/>
         </w:rPr>
-        <w:t xml:space="preserve"> (not used to store password as it can be easily decoded. Encoding can be done using </w:t>
-      </w:r>
-      <w:proofErr w:type="gramStart"/>
-      <w:r>
-        <w:rPr>
-          <w:lang w:val="en-IN"/>
-        </w:rPr>
-        <w:t>ASCII,BASE</w:t>
-      </w:r>
-      <w:proofErr w:type="gramEnd"/>
-      <w:r>
-        <w:rPr>
-          <w:lang w:val="en-IN"/>
-        </w:rPr>
-        <w:t>64) etc (usally used to sent images vidio where it will be sent in ecoded format and when reciever receive it will be decoded)</w:t>
+        <w:t xml:space="preserve"> (not used to store password as it can be easily decoded. Encoding can be done using ASCII,BASE64) etc (</w:t>
+      </w:r>
+      <w:proofErr w:type="spellStart"/>
+      <w:r>
+        <w:rPr>
+          <w:lang w:val="en-IN"/>
+        </w:rPr>
+        <w:t>usally</w:t>
+      </w:r>
+      <w:proofErr w:type="spellEnd"/>
+      <w:r>
+        <w:rPr>
+          <w:lang w:val="en-IN"/>
+        </w:rPr>
+        <w:t xml:space="preserve"> used to </w:t>
+      </w:r>
+      <w:proofErr w:type="spellStart"/>
+      <w:r>
+        <w:rPr>
+          <w:lang w:val="en-IN"/>
+        </w:rPr>
+        <w:t>sent</w:t>
+      </w:r>
+      <w:proofErr w:type="spellEnd"/>
+      <w:r>
+        <w:rPr>
+          <w:lang w:val="en-IN"/>
+        </w:rPr>
+        <w:t xml:space="preserve"> images </w:t>
+      </w:r>
+      <w:proofErr w:type="spellStart"/>
+      <w:r>
+        <w:rPr>
+          <w:lang w:val="en-IN"/>
+        </w:rPr>
+        <w:t>vidio</w:t>
+      </w:r>
+      <w:proofErr w:type="spellEnd"/>
+      <w:r>
+        <w:rPr>
+          <w:lang w:val="en-IN"/>
+        </w:rPr>
+        <w:t xml:space="preserve"> where it will be sent in </w:t>
+      </w:r>
+      <w:proofErr w:type="spellStart"/>
+      <w:r>
+        <w:rPr>
+          <w:lang w:val="en-IN"/>
+        </w:rPr>
+        <w:t>ecoded</w:t>
+      </w:r>
+      <w:proofErr w:type="spellEnd"/>
+      <w:r>
+        <w:rPr>
+          <w:lang w:val="en-IN"/>
+        </w:rPr>
+        <w:t xml:space="preserve"> format and when </w:t>
+      </w:r>
+      <w:proofErr w:type="spellStart"/>
+      <w:r>
+        <w:rPr>
+          <w:lang w:val="en-IN"/>
+        </w:rPr>
+        <w:t>reciever</w:t>
+      </w:r>
+      <w:proofErr w:type="spellEnd"/>
+      <w:r>
+        <w:rPr>
+          <w:lang w:val="en-IN"/>
+        </w:rPr>
+        <w:t xml:space="preserve"> receive it will be decoded)</w:t>
       </w:r>
     </w:p>
     <w:p>
@@ -580,69 +1039,139 @@
         <w:rPr>
           <w:lang w:val="en-IN"/>
         </w:rPr>
-        <w:t xml:space="preserve"> (we don’t use this for storing password as it need a key and if we lose the key then we can never verify is user entered password correct compared to encryted password stored in db) eg jwt token use this</w:t>
-      </w:r>
-    </w:p>
-    <w:p>
-      <w:pPr>
-        <w:rPr>
-          <w:lang w:val="en-IN"/>
-        </w:rPr>
-      </w:pPr>
-    </w:p>
-    <w:p>
-      <w:pPr>
-        <w:rPr>
-          <w:lang w:val="en-IN"/>
-        </w:rPr>
-      </w:pPr>
-      <w:r>
-        <w:rPr>
-          <w:lang w:val="en-IN"/>
-        </w:rPr>
-        <w:t xml:space="preserve">2 </w:t>
-      </w:r>
-      <w:proofErr w:type="gramStart"/>
-      <w:r>
-        <w:rPr>
-          <w:lang w:val="en-IN"/>
-        </w:rPr>
-        <w:t>type</w:t>
-      </w:r>
-      <w:proofErr w:type="gramEnd"/>
-    </w:p>
-    <w:p>
-      <w:pPr>
-        <w:rPr>
-          <w:lang w:val="en-IN"/>
-        </w:rPr>
-      </w:pPr>
-    </w:p>
-    <w:p>
-      <w:pPr>
-        <w:rPr>
-          <w:lang w:val="en-IN"/>
-        </w:rPr>
-      </w:pPr>
+        <w:t xml:space="preserve"> (we don’t use this for storing password as it need a key and if we lose the key then we can never verify is user entered password correct compared to </w:t>
+      </w:r>
+      <w:proofErr w:type="spellStart"/>
+      <w:r>
+        <w:rPr>
+          <w:lang w:val="en-IN"/>
+        </w:rPr>
+        <w:t>encryted</w:t>
+      </w:r>
+      <w:proofErr w:type="spellEnd"/>
+      <w:r>
+        <w:rPr>
+          <w:lang w:val="en-IN"/>
+        </w:rPr>
+        <w:t xml:space="preserve"> password stored in </w:t>
+      </w:r>
+      <w:proofErr w:type="spellStart"/>
+      <w:r>
+        <w:rPr>
+          <w:lang w:val="en-IN"/>
+        </w:rPr>
+        <w:t>db</w:t>
+      </w:r>
+      <w:proofErr w:type="spellEnd"/>
+      <w:r>
+        <w:rPr>
+          <w:lang w:val="en-IN"/>
+        </w:rPr>
+        <w:t xml:space="preserve">) </w:t>
+      </w:r>
+      <w:proofErr w:type="spellStart"/>
+      <w:r>
+        <w:rPr>
+          <w:lang w:val="en-IN"/>
+        </w:rPr>
+        <w:t>eg</w:t>
+      </w:r>
+      <w:proofErr w:type="spellEnd"/>
+      <w:r>
+        <w:rPr>
+          <w:lang w:val="en-IN"/>
+        </w:rPr>
+        <w:t xml:space="preserve"> </w:t>
+      </w:r>
+      <w:proofErr w:type="spellStart"/>
+      <w:r>
+        <w:rPr>
+          <w:lang w:val="en-IN"/>
+        </w:rPr>
+        <w:t>jwt</w:t>
+      </w:r>
+      <w:proofErr w:type="spellEnd"/>
+      <w:r>
+        <w:rPr>
+          <w:lang w:val="en-IN"/>
+        </w:rPr>
+        <w:t xml:space="preserve"> token use this</w:t>
+      </w:r>
+    </w:p>
+    <w:p>
+      <w:pPr>
+        <w:rPr>
+          <w:lang w:val="en-IN"/>
+        </w:rPr>
+      </w:pPr>
+    </w:p>
+    <w:p>
+      <w:pPr>
+        <w:rPr>
+          <w:lang w:val="en-IN"/>
+        </w:rPr>
+      </w:pPr>
+      <w:r>
+        <w:rPr>
+          <w:lang w:val="en-IN"/>
+        </w:rPr>
+        <w:t>2 type</w:t>
+      </w:r>
+    </w:p>
+    <w:p>
+      <w:pPr>
+        <w:rPr>
+          <w:lang w:val="en-IN"/>
+        </w:rPr>
+      </w:pPr>
+    </w:p>
+    <w:p>
+      <w:pPr>
+        <w:rPr>
+          <w:lang w:val="en-IN"/>
+        </w:rPr>
+      </w:pPr>
+      <w:proofErr w:type="spellStart"/>
       <w:r>
         <w:rPr>
           <w:lang w:val="en-IN"/>
         </w:rPr>
         <w:t>Symetric</w:t>
       </w:r>
-      <w:proofErr w:type="gramStart"/>
-      <w:r>
-        <w:rPr>
-          <w:lang w:val="en-IN"/>
-        </w:rPr>
-        <w:t>-  here</w:t>
-      </w:r>
-      <w:proofErr w:type="gramEnd"/>
-      <w:r>
-        <w:rPr>
-          <w:lang w:val="en-IN"/>
-        </w:rPr>
-        <w:t xml:space="preserve"> we just have one key and that is used for encryption and decryptiom ( the issue is secreat key is given to 3</w:t>
+      <w:proofErr w:type="spellEnd"/>
+      <w:r>
+        <w:rPr>
+          <w:lang w:val="en-IN"/>
+        </w:rPr>
+        <w:t xml:space="preserve">-  here we just have one key and that is used for encryption and </w:t>
+      </w:r>
+      <w:proofErr w:type="spellStart"/>
+      <w:r>
+        <w:rPr>
+          <w:lang w:val="en-IN"/>
+        </w:rPr>
+        <w:t>decryptiom</w:t>
+      </w:r>
+      <w:proofErr w:type="spellEnd"/>
+      <w:r>
+        <w:rPr>
+          <w:lang w:val="en-IN"/>
+        </w:rPr>
+        <w:t xml:space="preserve"> ( the issue is </w:t>
+      </w:r>
+      <w:proofErr w:type="spellStart"/>
+      <w:r>
+        <w:rPr>
+          <w:lang w:val="en-IN"/>
+        </w:rPr>
+        <w:t>secreat</w:t>
+      </w:r>
+      <w:proofErr w:type="spellEnd"/>
+      <w:r>
+        <w:rPr>
+          <w:lang w:val="en-IN"/>
+        </w:rPr>
+        <w:t xml:space="preserve"> key is given to 3</w:t>
       </w:r>
       <w:r>
         <w:rPr>
@@ -655,41 +1184,133 @@
         <w:rPr>
           <w:lang w:val="en-IN"/>
         </w:rPr>
-        <w:t xml:space="preserve"> party to login like the react so if they missue it then issue)</w:t>
-      </w:r>
-    </w:p>
-    <w:p>
-      <w:pPr>
-        <w:rPr>
-          <w:lang w:val="en-IN"/>
-        </w:rPr>
-      </w:pPr>
-    </w:p>
-    <w:p>
-      <w:pPr>
-        <w:rPr>
-          <w:lang w:val="en-IN"/>
-        </w:rPr>
-      </w:pPr>
-      <w:r>
-        <w:rPr>
-          <w:lang w:val="en-IN"/>
-        </w:rPr>
-        <w:t xml:space="preserve">Ascemetric-here 2 key are generated public and private so public key is given to everyone which they use to encryt and they sent this and decrption is done using private ket and this is only there with that person (inside the main orngainzation whi genrate private and public </w:t>
-      </w:r>
-      <w:proofErr w:type="gramStart"/>
-      <w:r>
-        <w:rPr>
-          <w:lang w:val="en-IN"/>
-        </w:rPr>
-        <w:t>key  people</w:t>
-      </w:r>
-      <w:proofErr w:type="gramEnd"/>
-      <w:r>
-        <w:rPr>
-          <w:lang w:val="en-IN"/>
-        </w:rPr>
-        <w:t xml:space="preserve"> may steal private key)</w:t>
+        <w:t xml:space="preserve"> party to login like the react so if they </w:t>
+      </w:r>
+      <w:proofErr w:type="spellStart"/>
+      <w:r>
+        <w:rPr>
+          <w:lang w:val="en-IN"/>
+        </w:rPr>
+        <w:t>missue</w:t>
+      </w:r>
+      <w:proofErr w:type="spellEnd"/>
+      <w:r>
+        <w:rPr>
+          <w:lang w:val="en-IN"/>
+        </w:rPr>
+        <w:t xml:space="preserve"> it then issue)</w:t>
+      </w:r>
+    </w:p>
+    <w:p>
+      <w:pPr>
+        <w:rPr>
+          <w:lang w:val="en-IN"/>
+        </w:rPr>
+      </w:pPr>
+    </w:p>
+    <w:p>
+      <w:pPr>
+        <w:rPr>
+          <w:lang w:val="en-IN"/>
+        </w:rPr>
+      </w:pPr>
+      <w:proofErr w:type="spellStart"/>
+      <w:r>
+        <w:rPr>
+          <w:lang w:val="en-IN"/>
+        </w:rPr>
+        <w:t>Ascemetric</w:t>
+      </w:r>
+      <w:proofErr w:type="spellEnd"/>
+      <w:r>
+        <w:rPr>
+          <w:lang w:val="en-IN"/>
+        </w:rPr>
+        <w:t xml:space="preserve">-here 2 key are generated public and private so public key is given to everyone which they use to </w:t>
+      </w:r>
+      <w:proofErr w:type="spellStart"/>
+      <w:r>
+        <w:rPr>
+          <w:lang w:val="en-IN"/>
+        </w:rPr>
+        <w:t>encryt</w:t>
+      </w:r>
+      <w:proofErr w:type="spellEnd"/>
+      <w:r>
+        <w:rPr>
+          <w:lang w:val="en-IN"/>
+        </w:rPr>
+        <w:t xml:space="preserve"> and they sent this and </w:t>
+      </w:r>
+      <w:proofErr w:type="spellStart"/>
+      <w:r>
+        <w:rPr>
+          <w:lang w:val="en-IN"/>
+        </w:rPr>
+        <w:t>decrption</w:t>
+      </w:r>
+      <w:proofErr w:type="spellEnd"/>
+      <w:r>
+        <w:rPr>
+          <w:lang w:val="en-IN"/>
+        </w:rPr>
+        <w:t xml:space="preserve"> is done using private </w:t>
+      </w:r>
+      <w:proofErr w:type="spellStart"/>
+      <w:r>
+        <w:rPr>
+          <w:lang w:val="en-IN"/>
+        </w:rPr>
+        <w:t>ket</w:t>
+      </w:r>
+      <w:proofErr w:type="spellEnd"/>
+      <w:r>
+        <w:rPr>
+          <w:lang w:val="en-IN"/>
+        </w:rPr>
+        <w:t xml:space="preserve"> and this is only there with that person (inside the main </w:t>
+      </w:r>
+      <w:proofErr w:type="spellStart"/>
+      <w:r>
+        <w:rPr>
+          <w:lang w:val="en-IN"/>
+        </w:rPr>
+        <w:t>orngainzation</w:t>
+      </w:r>
+      <w:proofErr w:type="spellEnd"/>
+      <w:r>
+        <w:rPr>
+          <w:lang w:val="en-IN"/>
+        </w:rPr>
+        <w:t xml:space="preserve"> </w:t>
+      </w:r>
+      <w:proofErr w:type="spellStart"/>
+      <w:r>
+        <w:rPr>
+          <w:lang w:val="en-IN"/>
+        </w:rPr>
+        <w:t>whi</w:t>
+      </w:r>
+      <w:proofErr w:type="spellEnd"/>
+      <w:r>
+        <w:rPr>
+          <w:lang w:val="en-IN"/>
+        </w:rPr>
+        <w:t xml:space="preserve"> </w:t>
+      </w:r>
+      <w:proofErr w:type="spellStart"/>
+      <w:r>
+        <w:rPr>
+          <w:lang w:val="en-IN"/>
+        </w:rPr>
+        <w:t>genrate</w:t>
+      </w:r>
+      <w:proofErr w:type="spellEnd"/>
+      <w:r>
+        <w:rPr>
+          <w:lang w:val="en-IN"/>
+        </w:rPr>
+        <w:t xml:space="preserve"> private and public key  people may steal private key)</w:t>
       </w:r>
     </w:p>
     <w:p>
@@ -706,7 +1327,6 @@
           <w:lang w:val="en-IN"/>
         </w:rPr>
       </w:pPr>
-      <w:proofErr w:type="gramStart"/>
       <w:r>
         <w:rPr>
           <w:highlight w:val="red"/>
@@ -714,13 +1334,37 @@
         </w:rPr>
         <w:t>Hashing(</w:t>
       </w:r>
-      <w:proofErr w:type="gramEnd"/>
+      <w:proofErr w:type="spellStart"/>
       <w:r>
         <w:rPr>
           <w:highlight w:val="red"/>
           <w:lang w:val="en-IN"/>
         </w:rPr>
-        <w:t>eg bcrypt)</w:t>
+        <w:t>eg</w:t>
+      </w:r>
+      <w:proofErr w:type="spellEnd"/>
+      <w:r>
+        <w:rPr>
+          <w:highlight w:val="red"/>
+          <w:lang w:val="en-IN"/>
+        </w:rPr>
+        <w:t xml:space="preserve"> </w:t>
+      </w:r>
+      <w:proofErr w:type="spellStart"/>
+      <w:r>
+        <w:rPr>
+          <w:highlight w:val="red"/>
+          <w:lang w:val="en-IN"/>
+        </w:rPr>
+        <w:t>bcrypt</w:t>
+      </w:r>
+      <w:proofErr w:type="spellEnd"/>
+      <w:r>
+        <w:rPr>
+          <w:highlight w:val="red"/>
+          <w:lang w:val="en-IN"/>
+        </w:rPr>
+        <w:t>)</w:t>
       </w:r>
     </w:p>
     <w:p>
@@ -742,33 +1386,47 @@
         </w:rPr>
         <w:t xml:space="preserve">Best way to store password in database is through hashing because it is one way. One hashed password </w:t>
       </w:r>
-      <w:proofErr w:type="gramStart"/>
+      <w:proofErr w:type="spellStart"/>
       <w:r>
         <w:rPr>
           <w:lang w:val="en-IN"/>
         </w:rPr>
         <w:t>cant</w:t>
       </w:r>
-      <w:proofErr w:type="gramEnd"/>
-      <w:r>
-        <w:rPr>
-          <w:lang w:val="en-IN"/>
-        </w:rPr>
-        <w:t xml:space="preserve"> be dehashed to get the plain password. There are many hashing </w:t>
-      </w:r>
-      <w:proofErr w:type="gramStart"/>
-      <w:r>
-        <w:rPr>
-          <w:lang w:val="en-IN"/>
-        </w:rPr>
-        <w:t>method</w:t>
-      </w:r>
-      <w:proofErr w:type="gramEnd"/>
-      <w:r>
-        <w:rPr>
-          <w:lang w:val="en-IN"/>
-        </w:rPr>
-        <w:t>. If we decide to use one it will always produce same length result for any input we give and also if we give same input again the hashed value will also be same everytime.</w:t>
+      <w:proofErr w:type="spellEnd"/>
+      <w:r>
+        <w:rPr>
+          <w:lang w:val="en-IN"/>
+        </w:rPr>
+        <w:t xml:space="preserve"> be </w:t>
+      </w:r>
+      <w:proofErr w:type="spellStart"/>
+      <w:r>
+        <w:rPr>
+          <w:lang w:val="en-IN"/>
+        </w:rPr>
+        <w:t>dehashed</w:t>
+      </w:r>
+      <w:proofErr w:type="spellEnd"/>
+      <w:r>
+        <w:rPr>
+          <w:lang w:val="en-IN"/>
+        </w:rPr>
+        <w:t xml:space="preserve"> to get the plain password. There are many hashing method. If we decide to use one it will always produce same length result for any input we give and also if we give same input again the hashed value will also be same </w:t>
+      </w:r>
+      <w:proofErr w:type="spellStart"/>
+      <w:r>
+        <w:rPr>
+          <w:lang w:val="en-IN"/>
+        </w:rPr>
+        <w:t>everytime</w:t>
+      </w:r>
+      <w:proofErr w:type="spellEnd"/>
+      <w:r>
+        <w:rPr>
+          <w:lang w:val="en-IN"/>
+        </w:rPr>
+        <w:t>.</w:t>
       </w:r>
     </w:p>
     <w:p>
@@ -808,55 +1466,27 @@
         <w:rPr>
           <w:lang w:val="en-IN"/>
         </w:rPr>
-        <w:t xml:space="preserve">Brute force-since each time for a password same hash is returned if hacker get access to the </w:t>
-      </w:r>
-      <w:proofErr w:type="gramStart"/>
-      <w:r>
-        <w:rPr>
-          <w:lang w:val="en-IN"/>
-        </w:rPr>
-        <w:t>database</w:t>
-      </w:r>
-      <w:proofErr w:type="gramEnd"/>
-      <w:r>
-        <w:rPr>
-          <w:lang w:val="en-IN"/>
-        </w:rPr>
-        <w:t xml:space="preserve"> they can try out different password and check if the hash matches with those hacked data</w:t>
-      </w:r>
-    </w:p>
-    <w:p>
-      <w:pPr>
-        <w:rPr>
-          <w:lang w:val="en-IN"/>
-        </w:rPr>
-      </w:pPr>
-    </w:p>
-    <w:p>
-      <w:pPr>
-        <w:rPr>
-          <w:lang w:val="en-IN"/>
-        </w:rPr>
-      </w:pPr>
-      <w:r>
-        <w:rPr>
-          <w:lang w:val="en-IN"/>
-        </w:rPr>
-        <w:t xml:space="preserve">Table issue- All possible passwords hash </w:t>
-      </w:r>
-      <w:proofErr w:type="gramStart"/>
-      <w:r>
-        <w:rPr>
-          <w:lang w:val="en-IN"/>
-        </w:rPr>
-        <w:t>are</w:t>
-      </w:r>
-      <w:proofErr w:type="gramEnd"/>
-      <w:r>
-        <w:rPr>
-          <w:lang w:val="en-IN"/>
-        </w:rPr>
-        <w:t xml:space="preserve"> already stored in a table </w:t>
+        <w:t>Brute force-since each time for a password same hash is returned if hacker get access to the database they can try out different password and check if the hash matches with those hacked data</w:t>
+      </w:r>
+    </w:p>
+    <w:p>
+      <w:pPr>
+        <w:rPr>
+          <w:lang w:val="en-IN"/>
+        </w:rPr>
+      </w:pPr>
+    </w:p>
+    <w:p>
+      <w:pPr>
+        <w:rPr>
+          <w:lang w:val="en-IN"/>
+        </w:rPr>
+      </w:pPr>
+      <w:r>
+        <w:rPr>
+          <w:lang w:val="en-IN"/>
+        </w:rPr>
+        <w:t xml:space="preserve">Table issue- All possible passwords hash are already stored in a table </w:t>
       </w:r>
     </w:p>
     <w:p>
@@ -896,152 +1526,260 @@
         <w:rPr>
           <w:lang w:val="en-IN"/>
         </w:rPr>
-        <w:t>Along with the password entered by the user we add a salt to it which is randomly generated and then store the hashed password (hash is calculated using both) in the db along with salt used. Because of this for each user password will be differently stored in db even if they entered same password. (solve table issue)</w:t>
-      </w:r>
-    </w:p>
-    <w:p>
-      <w:pPr>
-        <w:rPr>
-          <w:lang w:val="en-IN"/>
-        </w:rPr>
-      </w:pPr>
-    </w:p>
-    <w:p>
-      <w:pPr>
-        <w:rPr>
-          <w:lang w:val="en-IN"/>
-        </w:rPr>
-      </w:pPr>
-      <w:proofErr w:type="gramStart"/>
+        <w:t xml:space="preserve">Along with the password entered by the user we add a salt to it which is randomly generated and then store the hashed password (hash is calculated using both) in the </w:t>
+      </w:r>
+      <w:proofErr w:type="spellStart"/>
+      <w:r>
+        <w:rPr>
+          <w:lang w:val="en-IN"/>
+        </w:rPr>
+        <w:t>db</w:t>
+      </w:r>
+      <w:proofErr w:type="spellEnd"/>
+      <w:r>
+        <w:rPr>
+          <w:lang w:val="en-IN"/>
+        </w:rPr>
+        <w:t xml:space="preserve"> along with salt used. Because of this for each user password will be differently stored in </w:t>
+      </w:r>
+      <w:proofErr w:type="spellStart"/>
+      <w:r>
+        <w:rPr>
+          <w:lang w:val="en-IN"/>
+        </w:rPr>
+        <w:t>db</w:t>
+      </w:r>
+      <w:proofErr w:type="spellEnd"/>
+      <w:r>
+        <w:rPr>
+          <w:lang w:val="en-IN"/>
+        </w:rPr>
+        <w:t xml:space="preserve"> even if they entered same password. (solve table issue)</w:t>
+      </w:r>
+    </w:p>
+    <w:p>
+      <w:pPr>
+        <w:rPr>
+          <w:lang w:val="en-IN"/>
+        </w:rPr>
+      </w:pPr>
+    </w:p>
+    <w:p>
+      <w:pPr>
+        <w:rPr>
+          <w:lang w:val="en-IN"/>
+        </w:rPr>
+      </w:pPr>
       <w:r>
         <w:rPr>
           <w:lang w:val="en-IN"/>
         </w:rPr>
         <w:lastRenderedPageBreak/>
-        <w:t>Also</w:t>
-      </w:r>
-      <w:proofErr w:type="gramEnd"/>
-      <w:r>
-        <w:rPr>
-          <w:lang w:val="en-IN"/>
-        </w:rPr>
-        <w:t xml:space="preserve"> we have to use methods like bcrypts to slow down the hash generation process so that the hacker will take more time to generate hash value.  (solve brute force issue)</w:t>
-      </w:r>
-    </w:p>
-    <w:p>
-      <w:pPr>
-        <w:rPr>
-          <w:lang w:val="en-IN"/>
-        </w:rPr>
-      </w:pPr>
-    </w:p>
-    <w:p>
-      <w:pPr>
-        <w:rPr>
-          <w:highlight w:val="cyan"/>
-          <w:lang w:val="en-IN"/>
-        </w:rPr>
-      </w:pPr>
-      <w:r>
-        <w:rPr>
-          <w:highlight w:val="cyan"/>
-          <w:lang w:val="en-IN"/>
-        </w:rPr>
-        <w:t>When we use password encoder in spring boot it does both automatically add salt and bcrpt hashing</w:t>
-      </w:r>
-    </w:p>
-    <w:p>
-      <w:pPr>
-        <w:rPr>
-          <w:highlight w:val="cyan"/>
-          <w:lang w:val="en-IN"/>
-        </w:rPr>
-      </w:pPr>
-    </w:p>
-    <w:p>
-      <w:pPr>
-        <w:rPr>
-          <w:highlight w:val="cyan"/>
-          <w:lang w:val="en-IN"/>
-        </w:rPr>
-      </w:pPr>
-    </w:p>
-    <w:p>
-      <w:pPr>
-        <w:rPr>
-          <w:highlight w:val="cyan"/>
-          <w:lang w:val="en-IN"/>
-        </w:rPr>
-      </w:pPr>
-    </w:p>
-    <w:p>
-      <w:pPr>
-        <w:rPr>
-          <w:highlight w:val="cyan"/>
-          <w:lang w:val="en-IN"/>
-        </w:rPr>
-      </w:pPr>
-      <w:r>
-        <w:rPr>
-          <w:highlight w:val="cyan"/>
-          <w:lang w:val="en-IN"/>
-        </w:rPr>
-        <w:t>Custom exception handelling in spring for spring security</w:t>
-      </w:r>
-    </w:p>
-    <w:p>
-      <w:pPr>
-        <w:rPr>
-          <w:highlight w:val="cyan"/>
-          <w:lang w:val="en-IN"/>
-        </w:rPr>
-      </w:pPr>
-    </w:p>
-    <w:p>
-      <w:pPr>
-        <w:rPr>
-          <w:lang w:val="en-IN"/>
-        </w:rPr>
-      </w:pPr>
-      <w:r>
-        <w:rPr>
-          <w:lang w:val="en-IN"/>
-        </w:rPr>
-        <w:t xml:space="preserve">There are mainly two type error 401 not authenticated (wrong </w:t>
-      </w:r>
-      <w:proofErr w:type="gramStart"/>
-      <w:r>
-        <w:rPr>
-          <w:lang w:val="en-IN"/>
-        </w:rPr>
-        <w:t>credential)  and</w:t>
-      </w:r>
-      <w:proofErr w:type="gramEnd"/>
-      <w:r>
-        <w:rPr>
-          <w:lang w:val="en-IN"/>
-        </w:rPr>
-        <w:t xml:space="preserve"> 403 not authorized (no role) </w:t>
-      </w:r>
-    </w:p>
-    <w:p>
-      <w:pPr>
-        <w:rPr>
-          <w:lang w:val="en-IN"/>
-        </w:rPr>
-      </w:pPr>
-    </w:p>
-    <w:p>
-      <w:pPr>
-        <w:rPr>
-          <w:lang w:val="en-IN"/>
-        </w:rPr>
-      </w:pPr>
-      <w:r>
-        <w:rPr>
-          <w:lang w:val="en-IN"/>
-        </w:rPr>
-        <w:t>In spring mainly these are handeld by ExceptionTranslationFilter in that AutheticationEntryPoint interface handle all type of 401 errors and AccessDeniedHandler Interface handle all 403 errors so if we want to make any custom need to implement these for spring security exceptions.</w:t>
+        <w:t xml:space="preserve">Also we have to use methods like </w:t>
+      </w:r>
+      <w:proofErr w:type="spellStart"/>
+      <w:r>
+        <w:rPr>
+          <w:lang w:val="en-IN"/>
+        </w:rPr>
+        <w:t>bcrypts</w:t>
+      </w:r>
+      <w:proofErr w:type="spellEnd"/>
+      <w:r>
+        <w:rPr>
+          <w:lang w:val="en-IN"/>
+        </w:rPr>
+        <w:t xml:space="preserve"> to slow down the hash generation process so that the hacker will take more time to generate hash value.  (solve brute force issue)</w:t>
+      </w:r>
+    </w:p>
+    <w:p>
+      <w:pPr>
+        <w:rPr>
+          <w:lang w:val="en-IN"/>
+        </w:rPr>
+      </w:pPr>
+    </w:p>
+    <w:p>
+      <w:pPr>
+        <w:rPr>
+          <w:highlight w:val="cyan"/>
+          <w:lang w:val="en-IN"/>
+        </w:rPr>
+      </w:pPr>
+      <w:r>
+        <w:rPr>
+          <w:highlight w:val="cyan"/>
+          <w:lang w:val="en-IN"/>
+        </w:rPr>
+        <w:t xml:space="preserve">When we use password encoder in spring boot it does both automatically add salt and </w:t>
+      </w:r>
+      <w:proofErr w:type="spellStart"/>
+      <w:r>
+        <w:rPr>
+          <w:highlight w:val="cyan"/>
+          <w:lang w:val="en-IN"/>
+        </w:rPr>
+        <w:t>bcrpt</w:t>
+      </w:r>
+      <w:proofErr w:type="spellEnd"/>
+      <w:r>
+        <w:rPr>
+          <w:highlight w:val="cyan"/>
+          <w:lang w:val="en-IN"/>
+        </w:rPr>
+        <w:t xml:space="preserve"> hashing</w:t>
+      </w:r>
+    </w:p>
+    <w:p>
+      <w:pPr>
+        <w:rPr>
+          <w:highlight w:val="cyan"/>
+          <w:lang w:val="en-IN"/>
+        </w:rPr>
+      </w:pPr>
+    </w:p>
+    <w:p>
+      <w:pPr>
+        <w:rPr>
+          <w:highlight w:val="cyan"/>
+          <w:lang w:val="en-IN"/>
+        </w:rPr>
+      </w:pPr>
+    </w:p>
+    <w:p>
+      <w:pPr>
+        <w:rPr>
+          <w:highlight w:val="cyan"/>
+          <w:lang w:val="en-IN"/>
+        </w:rPr>
+      </w:pPr>
+    </w:p>
+    <w:p>
+      <w:pPr>
+        <w:rPr>
+          <w:highlight w:val="cyan"/>
+          <w:lang w:val="en-IN"/>
+        </w:rPr>
+      </w:pPr>
+      <w:r>
+        <w:rPr>
+          <w:highlight w:val="cyan"/>
+          <w:lang w:val="en-IN"/>
+        </w:rPr>
+        <w:t xml:space="preserve">Custom exception </w:t>
+      </w:r>
+      <w:proofErr w:type="spellStart"/>
+      <w:r>
+        <w:rPr>
+          <w:highlight w:val="cyan"/>
+          <w:lang w:val="en-IN"/>
+        </w:rPr>
+        <w:t>handelling</w:t>
+      </w:r>
+      <w:proofErr w:type="spellEnd"/>
+      <w:r>
+        <w:rPr>
+          <w:highlight w:val="cyan"/>
+          <w:lang w:val="en-IN"/>
+        </w:rPr>
+        <w:t xml:space="preserve"> in spring for spring security</w:t>
+      </w:r>
+    </w:p>
+    <w:p>
+      <w:pPr>
+        <w:rPr>
+          <w:highlight w:val="cyan"/>
+          <w:lang w:val="en-IN"/>
+        </w:rPr>
+      </w:pPr>
+    </w:p>
+    <w:p>
+      <w:pPr>
+        <w:rPr>
+          <w:lang w:val="en-IN"/>
+        </w:rPr>
+      </w:pPr>
+      <w:r>
+        <w:rPr>
+          <w:lang w:val="en-IN"/>
+        </w:rPr>
+        <w:t xml:space="preserve">There are mainly two type error 401 not authenticated (wrong credential)  and 403 not authorized (no role) </w:t>
+      </w:r>
+    </w:p>
+    <w:p>
+      <w:pPr>
+        <w:rPr>
+          <w:lang w:val="en-IN"/>
+        </w:rPr>
+      </w:pPr>
+    </w:p>
+    <w:p>
+      <w:pPr>
+        <w:rPr>
+          <w:lang w:val="en-IN"/>
+        </w:rPr>
+      </w:pPr>
+      <w:r>
+        <w:rPr>
+          <w:lang w:val="en-IN"/>
+        </w:rPr>
+        <w:t xml:space="preserve">In spring mainly these are </w:t>
+      </w:r>
+      <w:proofErr w:type="spellStart"/>
+      <w:r>
+        <w:rPr>
+          <w:lang w:val="en-IN"/>
+        </w:rPr>
+        <w:t>handeld</w:t>
+      </w:r>
+      <w:proofErr w:type="spellEnd"/>
+      <w:r>
+        <w:rPr>
+          <w:lang w:val="en-IN"/>
+        </w:rPr>
+        <w:t xml:space="preserve"> by </w:t>
+      </w:r>
+      <w:proofErr w:type="spellStart"/>
+      <w:r>
+        <w:rPr>
+          <w:lang w:val="en-IN"/>
+        </w:rPr>
+        <w:t>ExceptionTranslationFilter</w:t>
+      </w:r>
+      <w:proofErr w:type="spellEnd"/>
+      <w:r>
+        <w:rPr>
+          <w:lang w:val="en-IN"/>
+        </w:rPr>
+        <w:t xml:space="preserve"> in that </w:t>
+      </w:r>
+      <w:proofErr w:type="spellStart"/>
+      <w:r>
+        <w:rPr>
+          <w:lang w:val="en-IN"/>
+        </w:rPr>
+        <w:t>AutheticationEntryPoint</w:t>
+      </w:r>
+      <w:proofErr w:type="spellEnd"/>
+      <w:r>
+        <w:rPr>
+          <w:lang w:val="en-IN"/>
+        </w:rPr>
+        <w:t xml:space="preserve"> interface handle all type of 401 errors and </w:t>
+      </w:r>
+      <w:proofErr w:type="spellStart"/>
+      <w:r>
+        <w:rPr>
+          <w:lang w:val="en-IN"/>
+        </w:rPr>
+        <w:t>AccessDeniedHandler</w:t>
+      </w:r>
+      <w:proofErr w:type="spellEnd"/>
+      <w:r>
+        <w:rPr>
+          <w:lang w:val="en-IN"/>
+        </w:rPr>
+        <w:t xml:space="preserve"> Interface handle all 403 errors so if we want to make any custom need to implement these for spring security exceptions.</w:t>
       </w:r>
     </w:p>
     <w:p>
@@ -1091,7 +1829,21 @@
         <w:rPr>
           <w:lang w:val="en-IN"/>
         </w:rPr>
-        <w:t xml:space="preserve"> Hacker hacks and get the session id either stored in browser cookie or url to prevent this we have to use https and also set valid time of a session id to less time.</w:t>
+        <w:t xml:space="preserve"> Hacker hacks and get the session id either stored in browser cookie or </w:t>
+      </w:r>
+      <w:proofErr w:type="spellStart"/>
+      <w:r>
+        <w:rPr>
+          <w:lang w:val="en-IN"/>
+        </w:rPr>
+        <w:t>url</w:t>
+      </w:r>
+      <w:proofErr w:type="spellEnd"/>
+      <w:r>
+        <w:rPr>
+          <w:lang w:val="en-IN"/>
+        </w:rPr>
+        <w:t xml:space="preserve"> to prevent this we have to use https and also set valid time of a session id to less time.</w:t>
       </w:r>
     </w:p>
     <w:p>
@@ -1118,29 +1870,86 @@
         <w:rPr>
           <w:lang w:val="en-IN"/>
         </w:rPr>
-        <w:t xml:space="preserve"> Hacker logins in and create a session and then sent a link to someone with session id in the url so once user click this link and login it will be given this same session id and then hacker can attack. To avoid this spring has inbuilt setup it uses sessionfixation (there is no need to mention if we use the default config of sessionfixation that is “change session” otherwise we need to mention if we want to use “newSession” or “migrate session”)</w:t>
-      </w:r>
-    </w:p>
-    <w:p>
-      <w:pPr>
-        <w:rPr>
-          <w:lang w:val="en-IN"/>
-        </w:rPr>
-      </w:pPr>
-    </w:p>
-    <w:p>
-      <w:pPr>
-        <w:rPr>
-          <w:lang w:val="en-IN"/>
-        </w:rPr>
-      </w:pPr>
-    </w:p>
-    <w:p>
-      <w:pPr>
-        <w:rPr>
-          <w:lang w:val="en-IN"/>
-        </w:rPr>
-      </w:pPr>
+        <w:t xml:space="preserve"> Hacker logins in and create a session and then sent a link to someone with session id in the </w:t>
+      </w:r>
+      <w:proofErr w:type="spellStart"/>
+      <w:r>
+        <w:rPr>
+          <w:lang w:val="en-IN"/>
+        </w:rPr>
+        <w:t>url</w:t>
+      </w:r>
+      <w:proofErr w:type="spellEnd"/>
+      <w:r>
+        <w:rPr>
+          <w:lang w:val="en-IN"/>
+        </w:rPr>
+        <w:t xml:space="preserve"> so once user click this link and login it will be given this same session id and then hacker can attack. To avoid this spring has inbuilt setup it uses </w:t>
+      </w:r>
+      <w:proofErr w:type="spellStart"/>
+      <w:r>
+        <w:rPr>
+          <w:lang w:val="en-IN"/>
+        </w:rPr>
+        <w:t>sessionfixation</w:t>
+      </w:r>
+      <w:proofErr w:type="spellEnd"/>
+      <w:r>
+        <w:rPr>
+          <w:lang w:val="en-IN"/>
+        </w:rPr>
+        <w:t xml:space="preserve"> (there is no need to mention if we use the default config of </w:t>
+      </w:r>
+      <w:proofErr w:type="spellStart"/>
+      <w:r>
+        <w:rPr>
+          <w:lang w:val="en-IN"/>
+        </w:rPr>
+        <w:t>sessionfixation</w:t>
+      </w:r>
+      <w:proofErr w:type="spellEnd"/>
+      <w:r>
+        <w:rPr>
+          <w:lang w:val="en-IN"/>
+        </w:rPr>
+        <w:t xml:space="preserve"> that is “change session” otherwise we need to mention if we want to use “</w:t>
+      </w:r>
+      <w:proofErr w:type="spellStart"/>
+      <w:r>
+        <w:rPr>
+          <w:lang w:val="en-IN"/>
+        </w:rPr>
+        <w:t>newSession</w:t>
+      </w:r>
+      <w:proofErr w:type="spellEnd"/>
+      <w:r>
+        <w:rPr>
+          <w:lang w:val="en-IN"/>
+        </w:rPr>
+        <w:t>” or “migrate session”)</w:t>
+      </w:r>
+    </w:p>
+    <w:p>
+      <w:pPr>
+        <w:rPr>
+          <w:lang w:val="en-IN"/>
+        </w:rPr>
+      </w:pPr>
+    </w:p>
+    <w:p>
+      <w:pPr>
+        <w:rPr>
+          <w:lang w:val="en-IN"/>
+        </w:rPr>
+      </w:pPr>
+    </w:p>
+    <w:p>
+      <w:pPr>
+        <w:rPr>
+          <w:lang w:val="en-IN"/>
+        </w:rPr>
+      </w:pPr>
+      <w:proofErr w:type="spellStart"/>
       <w:r>
         <w:rPr>
           <w:highlight w:val="cyan"/>
@@ -1148,6 +1957,7 @@
         </w:rPr>
         <w:t>AutheticationEvents</w:t>
       </w:r>
+      <w:proofErr w:type="spellEnd"/>
       <w:r>
         <w:rPr>
           <w:lang w:val="en-IN"/>
@@ -1168,40 +1978,45 @@
           <w:lang w:val="en-IN"/>
         </w:rPr>
       </w:pPr>
+      <w:proofErr w:type="spellStart"/>
       <w:r>
         <w:rPr>
           <w:lang w:val="en-IN"/>
         </w:rPr>
         <w:t>AutheticationSuccessEvent</w:t>
       </w:r>
-    </w:p>
-    <w:p>
-      <w:pPr>
-        <w:rPr>
-          <w:lang w:val="en-IN"/>
-        </w:rPr>
-      </w:pPr>
+      <w:proofErr w:type="spellEnd"/>
+    </w:p>
+    <w:p>
+      <w:pPr>
+        <w:rPr>
+          <w:lang w:val="en-IN"/>
+        </w:rPr>
+      </w:pPr>
+      <w:proofErr w:type="spellStart"/>
       <w:r>
         <w:rPr>
           <w:lang w:val="en-IN"/>
         </w:rPr>
         <w:t>AbstractAutheticationFailtureEvent</w:t>
       </w:r>
-    </w:p>
-    <w:p>
-      <w:pPr>
-        <w:rPr>
-          <w:lang w:val="en-IN"/>
-        </w:rPr>
-      </w:pPr>
-    </w:p>
-    <w:p>
-      <w:pPr>
-        <w:rPr>
-          <w:highlight w:val="cyan"/>
-          <w:lang w:val="en-IN"/>
-        </w:rPr>
-      </w:pPr>
+      <w:proofErr w:type="spellEnd"/>
+    </w:p>
+    <w:p>
+      <w:pPr>
+        <w:rPr>
+          <w:lang w:val="en-IN"/>
+        </w:rPr>
+      </w:pPr>
+    </w:p>
+    <w:p>
+      <w:pPr>
+        <w:rPr>
+          <w:highlight w:val="cyan"/>
+          <w:lang w:val="en-IN"/>
+        </w:rPr>
+      </w:pPr>
+      <w:proofErr w:type="spellStart"/>
       <w:r>
         <w:rPr>
           <w:highlight w:val="cyan"/>
@@ -1209,48 +2024,51 @@
         </w:rPr>
         <w:t>AuthorizationEvent</w:t>
       </w:r>
-    </w:p>
-    <w:p>
-      <w:pPr>
-        <w:rPr>
-          <w:lang w:val="en-IN"/>
-        </w:rPr>
-      </w:pPr>
-    </w:p>
-    <w:p>
-      <w:pPr>
-        <w:rPr>
-          <w:lang w:val="en-IN"/>
-        </w:rPr>
-      </w:pPr>
+      <w:proofErr w:type="spellEnd"/>
+    </w:p>
+    <w:p>
+      <w:pPr>
+        <w:rPr>
+          <w:lang w:val="en-IN"/>
+        </w:rPr>
+      </w:pPr>
+    </w:p>
+    <w:p>
+      <w:pPr>
+        <w:rPr>
+          <w:lang w:val="en-IN"/>
+        </w:rPr>
+      </w:pPr>
+      <w:proofErr w:type="spellStart"/>
       <w:r>
         <w:rPr>
           <w:lang w:val="en-IN"/>
         </w:rPr>
         <w:t>AuthorizationDeniedEvent</w:t>
       </w:r>
-    </w:p>
-    <w:p>
-      <w:pPr>
-        <w:rPr>
-          <w:lang w:val="en-IN"/>
-        </w:rPr>
-      </w:pPr>
-    </w:p>
-    <w:p>
-      <w:pPr>
-        <w:rPr>
-          <w:lang w:val="en-IN"/>
-        </w:rPr>
-      </w:pPr>
-      <w:proofErr w:type="gramStart"/>
+      <w:proofErr w:type="spellEnd"/>
+    </w:p>
+    <w:p>
+      <w:pPr>
+        <w:rPr>
+          <w:lang w:val="en-IN"/>
+        </w:rPr>
+      </w:pPr>
+    </w:p>
+    <w:p>
+      <w:pPr>
+        <w:rPr>
+          <w:lang w:val="en-IN"/>
+        </w:rPr>
+      </w:pPr>
+      <w:proofErr w:type="spellStart"/>
       <w:r>
         <w:rPr>
           <w:lang w:val="en-IN"/>
         </w:rPr>
         <w:t>Alo</w:t>
       </w:r>
-      <w:proofErr w:type="gramEnd"/>
+      <w:proofErr w:type="spellEnd"/>
       <w:r>
         <w:rPr>
           <w:lang w:val="en-IN"/>
@@ -1277,23 +2095,87 @@
           <w:highlight w:val="cyan"/>
           <w:lang w:val="en-IN"/>
         </w:rPr>
-        <w:t xml:space="preserve">But if we want to redirect we cant use the above we need to </w:t>
-      </w:r>
-      <w:proofErr w:type="gramStart"/>
-      <w:r>
-        <w:rPr>
-          <w:highlight w:val="cyan"/>
-          <w:lang w:val="en-IN"/>
-        </w:rPr>
-        <w:t>use .successHandles</w:t>
-      </w:r>
-      <w:proofErr w:type="gramEnd"/>
-      <w:r>
-        <w:rPr>
-          <w:highlight w:val="cyan"/>
-          <w:lang w:val="en-IN"/>
-        </w:rPr>
-        <w:t xml:space="preserve"> .FalitureHandler in formLogin see in easyBank Project</w:t>
+        <w:t xml:space="preserve">But if we want to redirect we </w:t>
+      </w:r>
+      <w:proofErr w:type="spellStart"/>
+      <w:r>
+        <w:rPr>
+          <w:highlight w:val="cyan"/>
+          <w:lang w:val="en-IN"/>
+        </w:rPr>
+        <w:t>cant</w:t>
+      </w:r>
+      <w:proofErr w:type="spellEnd"/>
+      <w:r>
+        <w:rPr>
+          <w:highlight w:val="cyan"/>
+          <w:lang w:val="en-IN"/>
+        </w:rPr>
+        <w:t xml:space="preserve"> use the above we need to use .</w:t>
+      </w:r>
+      <w:proofErr w:type="spellStart"/>
+      <w:r>
+        <w:rPr>
+          <w:highlight w:val="cyan"/>
+          <w:lang w:val="en-IN"/>
+        </w:rPr>
+        <w:t>successHandles</w:t>
+      </w:r>
+      <w:proofErr w:type="spellEnd"/>
+      <w:r>
+        <w:rPr>
+          <w:highlight w:val="cyan"/>
+          <w:lang w:val="en-IN"/>
+        </w:rPr>
+        <w:t xml:space="preserve"> .</w:t>
+      </w:r>
+      <w:proofErr w:type="spellStart"/>
+      <w:r>
+        <w:rPr>
+          <w:highlight w:val="cyan"/>
+          <w:lang w:val="en-IN"/>
+        </w:rPr>
+        <w:t>FalitureHandler</w:t>
+      </w:r>
+      <w:proofErr w:type="spellEnd"/>
+      <w:r>
+        <w:rPr>
+          <w:highlight w:val="cyan"/>
+          <w:lang w:val="en-IN"/>
+        </w:rPr>
+        <w:t xml:space="preserve"> in </w:t>
+      </w:r>
+      <w:proofErr w:type="spellStart"/>
+      <w:r>
+        <w:rPr>
+          <w:highlight w:val="cyan"/>
+          <w:lang w:val="en-IN"/>
+        </w:rPr>
+        <w:t>formLogin</w:t>
+      </w:r>
+      <w:proofErr w:type="spellEnd"/>
+      <w:r>
+        <w:rPr>
+          <w:highlight w:val="cyan"/>
+          <w:lang w:val="en-IN"/>
+        </w:rPr>
+        <w:t xml:space="preserve"> see in </w:t>
+      </w:r>
+      <w:proofErr w:type="spellStart"/>
+      <w:r>
+        <w:rPr>
+          <w:highlight w:val="cyan"/>
+          <w:lang w:val="en-IN"/>
+        </w:rPr>
+        <w:t>easyBank</w:t>
+      </w:r>
+      <w:proofErr w:type="spellEnd"/>
+      <w:r>
+        <w:rPr>
+          <w:highlight w:val="cyan"/>
+          <w:lang w:val="en-IN"/>
+        </w:rPr>
+        <w:t xml:space="preserve"> Project</w:t>
       </w:r>
     </w:p>
     <w:p>
@@ -1327,30 +2209,38 @@
         <w:rPr>
           <w:lang w:val="en-IN"/>
         </w:rPr>
-        <w:t>help us to use log without defining it like log=logger. but to use that we need to add a dependency lombok</w:t>
-      </w:r>
-    </w:p>
-    <w:p>
-      <w:pPr>
-        <w:rPr>
-          <w:lang w:val="en-IN"/>
-        </w:rPr>
-      </w:pPr>
-    </w:p>
-    <w:p>
-      <w:pPr>
-        <w:rPr>
-          <w:lang w:val="en-IN"/>
-        </w:rPr>
-      </w:pPr>
-    </w:p>
-    <w:p>
-      <w:pPr>
-        <w:rPr>
-          <w:lang w:val="en-IN"/>
-        </w:rPr>
-      </w:pPr>
-      <w:proofErr w:type="gramStart"/>
+        <w:t xml:space="preserve">help us to use log without defining it like log=logger. but to use that we need to add a dependency </w:t>
+      </w:r>
+      <w:proofErr w:type="spellStart"/>
+      <w:r>
+        <w:rPr>
+          <w:lang w:val="en-IN"/>
+        </w:rPr>
+        <w:t>lombok</w:t>
+      </w:r>
+      <w:proofErr w:type="spellEnd"/>
+    </w:p>
+    <w:p>
+      <w:pPr>
+        <w:rPr>
+          <w:lang w:val="en-IN"/>
+        </w:rPr>
+      </w:pPr>
+    </w:p>
+    <w:p>
+      <w:pPr>
+        <w:rPr>
+          <w:lang w:val="en-IN"/>
+        </w:rPr>
+      </w:pPr>
+    </w:p>
+    <w:p>
+      <w:pPr>
+        <w:rPr>
+          <w:lang w:val="en-IN"/>
+        </w:rPr>
+      </w:pPr>
+      <w:proofErr w:type="spellStart"/>
       <w:r>
         <w:rPr>
           <w:highlight w:val="cyan"/>
@@ -1358,80 +2248,82 @@
         </w:rPr>
         <w:t>Cors</w:t>
       </w:r>
-      <w:proofErr w:type="gramEnd"/>
-      <w:r>
-        <w:rPr>
-          <w:highlight w:val="cyan"/>
-          <w:lang w:val="en-IN"/>
-        </w:rPr>
-        <w:t xml:space="preserve"> setup using CorsConfigurationSource</w:t>
-      </w:r>
-    </w:p>
-    <w:p>
-      <w:pPr>
-        <w:rPr>
-          <w:lang w:val="en-IN"/>
-        </w:rPr>
-      </w:pPr>
-    </w:p>
-    <w:p>
-      <w:pPr>
-        <w:rPr>
-          <w:highlight w:val="cyan"/>
-          <w:lang w:val="en-IN"/>
-        </w:rPr>
-      </w:pPr>
-      <w:r>
-        <w:rPr>
-          <w:highlight w:val="cyan"/>
-          <w:lang w:val="en-IN"/>
-        </w:rPr>
-        <w:t xml:space="preserve">Csrf setup </w:t>
-      </w:r>
-    </w:p>
-    <w:p>
-      <w:pPr>
-        <w:rPr>
-          <w:lang w:val="en-IN"/>
-        </w:rPr>
-      </w:pPr>
-    </w:p>
-    <w:p>
-      <w:pPr>
-        <w:rPr>
-          <w:lang w:val="en-IN"/>
-        </w:rPr>
-      </w:pPr>
-    </w:p>
-    <w:p>
-      <w:pPr>
-        <w:rPr>
-          <w:highlight w:val="cyan"/>
-          <w:lang w:val="en-IN"/>
-        </w:rPr>
-      </w:pPr>
-      <w:r>
-        <w:rPr>
-          <w:highlight w:val="cyan"/>
-          <w:lang w:val="en-IN"/>
-        </w:rPr>
-        <w:t xml:space="preserve">When we use basic authentication it can create a session so from next request onwards we can just use that session to login instead of using basic </w:t>
-      </w:r>
-      <w:proofErr w:type="gramStart"/>
-      <w:r>
-        <w:rPr>
-          <w:highlight w:val="cyan"/>
-          <w:lang w:val="en-IN"/>
-        </w:rPr>
-        <w:t>authentication(</w:t>
-      </w:r>
-      <w:proofErr w:type="gramEnd"/>
-      <w:r>
-        <w:rPr>
-          <w:highlight w:val="cyan"/>
-          <w:lang w:val="en-IN"/>
-        </w:rPr>
-        <w:t>that Is sending username password for each request) but basic auth will work even if we delete the session that get created</w:t>
+      <w:proofErr w:type="spellEnd"/>
+      <w:r>
+        <w:rPr>
+          <w:highlight w:val="cyan"/>
+          <w:lang w:val="en-IN"/>
+        </w:rPr>
+        <w:t xml:space="preserve"> setup using </w:t>
+      </w:r>
+      <w:proofErr w:type="spellStart"/>
+      <w:r>
+        <w:rPr>
+          <w:highlight w:val="cyan"/>
+          <w:lang w:val="en-IN"/>
+        </w:rPr>
+        <w:t>CorsConfigurationSource</w:t>
+      </w:r>
+      <w:proofErr w:type="spellEnd"/>
+    </w:p>
+    <w:p>
+      <w:pPr>
+        <w:rPr>
+          <w:lang w:val="en-IN"/>
+        </w:rPr>
+      </w:pPr>
+    </w:p>
+    <w:p>
+      <w:pPr>
+        <w:rPr>
+          <w:highlight w:val="cyan"/>
+          <w:lang w:val="en-IN"/>
+        </w:rPr>
+      </w:pPr>
+      <w:proofErr w:type="spellStart"/>
+      <w:r>
+        <w:rPr>
+          <w:highlight w:val="cyan"/>
+          <w:lang w:val="en-IN"/>
+        </w:rPr>
+        <w:t>Csrf</w:t>
+      </w:r>
+      <w:proofErr w:type="spellEnd"/>
+      <w:r>
+        <w:rPr>
+          <w:highlight w:val="cyan"/>
+          <w:lang w:val="en-IN"/>
+        </w:rPr>
+        <w:t xml:space="preserve"> setup </w:t>
+      </w:r>
+    </w:p>
+    <w:p>
+      <w:pPr>
+        <w:rPr>
+          <w:lang w:val="en-IN"/>
+        </w:rPr>
+      </w:pPr>
+    </w:p>
+    <w:p>
+      <w:pPr>
+        <w:rPr>
+          <w:lang w:val="en-IN"/>
+        </w:rPr>
+      </w:pPr>
+    </w:p>
+    <w:p>
+      <w:pPr>
+        <w:rPr>
+          <w:highlight w:val="cyan"/>
+          <w:lang w:val="en-IN"/>
+        </w:rPr>
+      </w:pPr>
+      <w:r>
+        <w:rPr>
+          <w:highlight w:val="cyan"/>
+          <w:lang w:val="en-IN"/>
+        </w:rPr>
+        <w:t>When we use basic authentication it can create a session so from next request onwards we can just use that session to login instead of using basic authentication(that Is sending username password for each request) but basic auth will work even if we delete the session that get created</w:t>
       </w:r>
     </w:p>
     <w:p>
@@ -1462,21 +2354,37 @@
         </w:rPr>
         <w:t>“@</w:t>
       </w:r>
-      <w:proofErr w:type="gramStart"/>
-      <w:r>
-        <w:rPr>
-          <w:highlight w:val="cyan"/>
-          <w:lang w:val="en-IN"/>
-        </w:rPr>
-        <w:t>EnableWebSecurity(</w:t>
-      </w:r>
-      <w:proofErr w:type="gramEnd"/>
-      <w:r>
-        <w:rPr>
-          <w:highlight w:val="cyan"/>
-          <w:lang w:val="en-IN"/>
-        </w:rPr>
-        <w:t xml:space="preserve">debug = true)” this along with adding in system property “logging.level.org.springframework.security=DEBUG” will allow us to show in the console all security filter used </w:t>
+      <w:proofErr w:type="spellStart"/>
+      <w:r>
+        <w:rPr>
+          <w:highlight w:val="cyan"/>
+          <w:lang w:val="en-IN"/>
+        </w:rPr>
+        <w:t>EnableWebSecurity</w:t>
+      </w:r>
+      <w:proofErr w:type="spellEnd"/>
+      <w:r>
+        <w:rPr>
+          <w:highlight w:val="cyan"/>
+          <w:lang w:val="en-IN"/>
+        </w:rPr>
+        <w:t>(debug = true)” this along with adding in system property “</w:t>
+      </w:r>
+      <w:proofErr w:type="spellStart"/>
+      <w:r>
+        <w:rPr>
+          <w:highlight w:val="cyan"/>
+          <w:lang w:val="en-IN"/>
+        </w:rPr>
+        <w:t>logging.level.org.springframework.security</w:t>
+      </w:r>
+      <w:proofErr w:type="spellEnd"/>
+      <w:r>
+        <w:rPr>
+          <w:highlight w:val="cyan"/>
+          <w:lang w:val="en-IN"/>
+        </w:rPr>
+        <w:t xml:space="preserve">=DEBUG” will allow us to show in the console all security filter used </w:t>
       </w:r>
     </w:p>
     <w:p>
@@ -1500,24 +2408,9 @@
           <w:highlight w:val="cyan"/>
           <w:lang w:val="en-IN"/>
         </w:rPr>
-        <w:t xml:space="preserve">To create a custom </w:t>
-      </w:r>
-      <w:proofErr w:type="gramStart"/>
-      <w:r>
-        <w:rPr>
-          <w:highlight w:val="cyan"/>
-          <w:lang w:val="en-IN"/>
-        </w:rPr>
-        <w:t>filter</w:t>
-      </w:r>
-      <w:proofErr w:type="gramEnd"/>
-      <w:r>
-        <w:rPr>
-          <w:highlight w:val="cyan"/>
-          <w:lang w:val="en-IN"/>
-        </w:rPr>
-        <w:t xml:space="preserve"> implement Filter or extend either </w:t>
-      </w:r>
+        <w:t xml:space="preserve">To create a custom filter implement Filter or extend either </w:t>
+      </w:r>
+      <w:proofErr w:type="spellStart"/>
       <w:r>
         <w:rPr>
           <w:rFonts w:ascii="SimSun" w:eastAsia="SimSun" w:hAnsi="SimSun" w:cs="SimSun"/>
@@ -1527,6 +2420,7 @@
         </w:rPr>
         <w:t>GenericFilterBean</w:t>
       </w:r>
+      <w:proofErr w:type="spellEnd"/>
       <w:r>
         <w:rPr>
           <w:rFonts w:ascii="SimSun" w:eastAsia="SimSun" w:hAnsi="SimSun" w:cs="SimSun"/>
@@ -1537,6 +2431,7 @@
         </w:rPr>
         <w:t xml:space="preserve"> or </w:t>
       </w:r>
+      <w:proofErr w:type="spellStart"/>
       <w:r>
         <w:rPr>
           <w:rFonts w:ascii="SimSun" w:eastAsia="SimSun" w:hAnsi="SimSun" w:cs="SimSun"/>
@@ -1546,6 +2441,7 @@
         </w:rPr>
         <w:t>OncePerRequestFilter</w:t>
       </w:r>
+      <w:proofErr w:type="spellEnd"/>
     </w:p>
     <w:p>
       <w:pPr>
@@ -1600,48 +2496,56 @@
         <w:rPr>
           <w:lang w:val="en-IN"/>
         </w:rPr>
-        <w:t>opaque token-There is no meaning for the string generated and to validate the token sent by client it must access server (auth server).  example (</w:t>
-      </w:r>
-      <w:proofErr w:type="gramStart"/>
-      <w:r>
-        <w:rPr>
-          <w:lang w:val="en-IN"/>
-        </w:rPr>
-        <w:t>session based</w:t>
-      </w:r>
-      <w:proofErr w:type="gramEnd"/>
-      <w:r>
-        <w:rPr>
-          <w:lang w:val="en-IN"/>
-        </w:rPr>
-        <w:t xml:space="preserve"> token)</w:t>
-      </w:r>
-    </w:p>
-    <w:p>
-      <w:pPr>
-        <w:rPr>
-          <w:lang w:val="en-IN"/>
-        </w:rPr>
-      </w:pPr>
-      <w:r>
-        <w:rPr>
-          <w:lang w:val="en-IN"/>
-        </w:rPr>
-        <w:t>jwt token-It contains meaning (</w:t>
-      </w:r>
-      <w:proofErr w:type="gramStart"/>
+        <w:t>opaque token-There is no meaning for the string generated and to validate the token sent by client it must access server (auth server).  example (session based token)</w:t>
+      </w:r>
+    </w:p>
+    <w:p>
+      <w:pPr>
+        <w:rPr>
+          <w:lang w:val="en-IN"/>
+        </w:rPr>
+      </w:pPr>
+      <w:proofErr w:type="spellStart"/>
+      <w:r>
+        <w:rPr>
+          <w:lang w:val="en-IN"/>
+        </w:rPr>
+        <w:t>jwt</w:t>
+      </w:r>
+      <w:proofErr w:type="spellEnd"/>
+      <w:r>
+        <w:rPr>
+          <w:lang w:val="en-IN"/>
+        </w:rPr>
+        <w:t xml:space="preserve"> token-It contains meaning (</w:t>
+      </w:r>
+      <w:proofErr w:type="spellStart"/>
       <w:r>
         <w:rPr>
           <w:lang w:val="en-IN"/>
         </w:rPr>
         <w:t>userdetails,expirydate</w:t>
       </w:r>
-      <w:proofErr w:type="gramEnd"/>
-      <w:r>
-        <w:rPr>
-          <w:lang w:val="en-IN"/>
-        </w:rPr>
-        <w:t xml:space="preserve"> etc) to validate no need to sent token to auth server</w:t>
+      <w:proofErr w:type="spellEnd"/>
+      <w:r>
+        <w:rPr>
+          <w:lang w:val="en-IN"/>
+        </w:rPr>
+        <w:t xml:space="preserve"> etc) to validate no need to </w:t>
+      </w:r>
+      <w:proofErr w:type="spellStart"/>
+      <w:r>
+        <w:rPr>
+          <w:lang w:val="en-IN"/>
+        </w:rPr>
+        <w:t>sent</w:t>
+      </w:r>
+      <w:proofErr w:type="spellEnd"/>
+      <w:r>
+        <w:rPr>
+          <w:lang w:val="en-IN"/>
+        </w:rPr>
+        <w:t xml:space="preserve"> token to auth server</w:t>
       </w:r>
     </w:p>
     <w:p>
@@ -1684,34 +2588,76 @@
         <w:rPr>
           <w:lang w:val="en-IN"/>
         </w:rPr>
-        <w:t xml:space="preserve"> bascially in a jwt we have </w:t>
-      </w:r>
-      <w:proofErr w:type="gramStart"/>
-      <w:r>
-        <w:rPr>
-          <w:lang w:val="en-IN"/>
-        </w:rPr>
-        <w:t>header,payload</w:t>
-      </w:r>
-      <w:proofErr w:type="gramEnd"/>
-      <w:r>
-        <w:rPr>
-          <w:lang w:val="en-IN"/>
-        </w:rPr>
-        <w:t>,signature, here we are getting details in the payload</w:t>
-      </w:r>
-    </w:p>
-    <w:p>
-      <w:pPr>
-        <w:rPr>
-          <w:lang w:val="en-IN"/>
-        </w:rPr>
-      </w:pPr>
-      <w:r>
-        <w:rPr>
-          <w:lang w:val="en-IN"/>
-        </w:rPr>
-        <w:t xml:space="preserve">     payload usally look like</w:t>
+        <w:t xml:space="preserve"> </w:t>
+      </w:r>
+      <w:proofErr w:type="spellStart"/>
+      <w:r>
+        <w:rPr>
+          <w:lang w:val="en-IN"/>
+        </w:rPr>
+        <w:t>bascially</w:t>
+      </w:r>
+      <w:proofErr w:type="spellEnd"/>
+      <w:r>
+        <w:rPr>
+          <w:lang w:val="en-IN"/>
+        </w:rPr>
+        <w:t xml:space="preserve"> in a </w:t>
+      </w:r>
+      <w:proofErr w:type="spellStart"/>
+      <w:r>
+        <w:rPr>
+          <w:lang w:val="en-IN"/>
+        </w:rPr>
+        <w:t>jwt</w:t>
+      </w:r>
+      <w:proofErr w:type="spellEnd"/>
+      <w:r>
+        <w:rPr>
+          <w:lang w:val="en-IN"/>
+        </w:rPr>
+        <w:t xml:space="preserve"> we have </w:t>
+      </w:r>
+      <w:proofErr w:type="spellStart"/>
+      <w:r>
+        <w:rPr>
+          <w:lang w:val="en-IN"/>
+        </w:rPr>
+        <w:t>header,payload,signature</w:t>
+      </w:r>
+      <w:proofErr w:type="spellEnd"/>
+      <w:r>
+        <w:rPr>
+          <w:lang w:val="en-IN"/>
+        </w:rPr>
+        <w:t>, here we are getting details in the payload</w:t>
+      </w:r>
+    </w:p>
+    <w:p>
+      <w:pPr>
+        <w:rPr>
+          <w:lang w:val="en-IN"/>
+        </w:rPr>
+      </w:pPr>
+      <w:r>
+        <w:rPr>
+          <w:lang w:val="en-IN"/>
+        </w:rPr>
+        <w:t xml:space="preserve">     payload </w:t>
+      </w:r>
+      <w:proofErr w:type="spellStart"/>
+      <w:r>
+        <w:rPr>
+          <w:lang w:val="en-IN"/>
+        </w:rPr>
+        <w:t>usally</w:t>
+      </w:r>
+      <w:proofErr w:type="spellEnd"/>
+      <w:r>
+        <w:rPr>
+          <w:lang w:val="en-IN"/>
+        </w:rPr>
+        <w:t xml:space="preserve"> look like</w:t>
       </w:r>
     </w:p>
     <w:p>
@@ -1737,20 +2683,48 @@
         <w:rPr>
           <w:lang w:val="en-IN"/>
         </w:rPr>
-        <w:t xml:space="preserve">               "sub": "susan",</w:t>
-      </w:r>
-    </w:p>
-    <w:p>
-      <w:pPr>
-        <w:rPr>
-          <w:lang w:val="en-IN"/>
-        </w:rPr>
-      </w:pPr>
-      <w:r>
-        <w:rPr>
-          <w:lang w:val="en-IN"/>
-        </w:rPr>
-        <w:t xml:space="preserve">                "iat": 1786289278,</w:t>
+        <w:t xml:space="preserve">               "sub": "</w:t>
+      </w:r>
+      <w:proofErr w:type="spellStart"/>
+      <w:r>
+        <w:rPr>
+          <w:lang w:val="en-IN"/>
+        </w:rPr>
+        <w:t>susan</w:t>
+      </w:r>
+      <w:proofErr w:type="spellEnd"/>
+      <w:r>
+        <w:rPr>
+          <w:lang w:val="en-IN"/>
+        </w:rPr>
+        <w:t>",</w:t>
+      </w:r>
+    </w:p>
+    <w:p>
+      <w:pPr>
+        <w:rPr>
+          <w:lang w:val="en-IN"/>
+        </w:rPr>
+      </w:pPr>
+      <w:r>
+        <w:rPr>
+          <w:lang w:val="en-IN"/>
+        </w:rPr>
+        <w:t xml:space="preserve">                "</w:t>
+      </w:r>
+      <w:proofErr w:type="spellStart"/>
+      <w:r>
+        <w:rPr>
+          <w:lang w:val="en-IN"/>
+        </w:rPr>
+        <w:t>iat</w:t>
+      </w:r>
+      <w:proofErr w:type="spellEnd"/>
+      <w:r>
+        <w:rPr>
+          <w:lang w:val="en-IN"/>
+        </w:rPr>
+        <w:t>": 1786289278,</w:t>
       </w:r>
     </w:p>
     <w:p>
@@ -1831,7 +2805,77 @@
         <w:rPr>
           <w:lang w:val="en-IN"/>
         </w:rPr>
-        <w:t>If we don’t want to use filters like (basicAuthenticationFilter and UserNamePasswordFilter) these usally calls Autheitcation Manager internally if we don’t use that then we make our own Authetication Manager</w:t>
+        <w:t>If we don’t want to use filters like (</w:t>
+      </w:r>
+      <w:proofErr w:type="spellStart"/>
+      <w:r>
+        <w:rPr>
+          <w:lang w:val="en-IN"/>
+        </w:rPr>
+        <w:t>basicAuthenticationFilter</w:t>
+      </w:r>
+      <w:proofErr w:type="spellEnd"/>
+      <w:r>
+        <w:rPr>
+          <w:lang w:val="en-IN"/>
+        </w:rPr>
+        <w:t xml:space="preserve"> and </w:t>
+      </w:r>
+      <w:proofErr w:type="spellStart"/>
+      <w:r>
+        <w:rPr>
+          <w:lang w:val="en-IN"/>
+        </w:rPr>
+        <w:t>UserNamePasswordFilter</w:t>
+      </w:r>
+      <w:proofErr w:type="spellEnd"/>
+      <w:r>
+        <w:rPr>
+          <w:lang w:val="en-IN"/>
+        </w:rPr>
+        <w:t xml:space="preserve">) these </w:t>
+      </w:r>
+      <w:proofErr w:type="spellStart"/>
+      <w:r>
+        <w:rPr>
+          <w:lang w:val="en-IN"/>
+        </w:rPr>
+        <w:t>usally</w:t>
+      </w:r>
+      <w:proofErr w:type="spellEnd"/>
+      <w:r>
+        <w:rPr>
+          <w:lang w:val="en-IN"/>
+        </w:rPr>
+        <w:t xml:space="preserve"> calls </w:t>
+      </w:r>
+      <w:proofErr w:type="spellStart"/>
+      <w:r>
+        <w:rPr>
+          <w:lang w:val="en-IN"/>
+        </w:rPr>
+        <w:t>Autheitcation</w:t>
+      </w:r>
+      <w:proofErr w:type="spellEnd"/>
+      <w:r>
+        <w:rPr>
+          <w:lang w:val="en-IN"/>
+        </w:rPr>
+        <w:t xml:space="preserve"> Manager internally if we don’t use that then we make our own </w:t>
+      </w:r>
+      <w:proofErr w:type="spellStart"/>
+      <w:r>
+        <w:rPr>
+          <w:lang w:val="en-IN"/>
+        </w:rPr>
+        <w:t>Authetication</w:t>
+      </w:r>
+      <w:proofErr w:type="spellEnd"/>
+      <w:r>
+        <w:rPr>
+          <w:lang w:val="en-IN"/>
+        </w:rPr>
+        <w:t xml:space="preserve"> Manager</w:t>
       </w:r>
     </w:p>
     <w:p>
@@ -1980,7 +3024,21 @@
         <w:rPr>
           <w:lang w:val="en-IN"/>
         </w:rPr>
-        <w:t>@PostAuthorize-run validation cehck after method execution</w:t>
+        <w:t xml:space="preserve">@PostAuthorize-run validation </w:t>
+      </w:r>
+      <w:proofErr w:type="spellStart"/>
+      <w:r>
+        <w:rPr>
+          <w:lang w:val="en-IN"/>
+        </w:rPr>
+        <w:t>cehck</w:t>
+      </w:r>
+      <w:proofErr w:type="spellEnd"/>
+      <w:r>
+        <w:rPr>
+          <w:lang w:val="en-IN"/>
+        </w:rPr>
+        <w:t xml:space="preserve"> after method execution</w:t>
       </w:r>
     </w:p>
     <w:p>
@@ -2115,43 +3173,73 @@
         <w:rPr>
           <w:lang w:val="en-IN"/>
         </w:rPr>
-        <w:t xml:space="preserve">- sits over Oauth to do authentication (but people now </w:t>
-      </w:r>
-      <w:proofErr w:type="gramStart"/>
-      <w:r>
-        <w:rPr>
-          <w:lang w:val="en-IN"/>
-        </w:rPr>
-        <w:t>uses</w:t>
-      </w:r>
-      <w:proofErr w:type="gramEnd"/>
-      <w:r>
-        <w:rPr>
-          <w:lang w:val="en-IN"/>
-        </w:rPr>
-        <w:t xml:space="preserve"> Oauth for authentication using sso)</w:t>
-      </w:r>
-    </w:p>
-    <w:p>
-      <w:pPr>
-        <w:rPr>
-          <w:lang w:val="en-IN"/>
-        </w:rPr>
-      </w:pPr>
-    </w:p>
-    <w:p>
-      <w:pPr>
-        <w:rPr>
-          <w:lang w:val="en-IN"/>
-        </w:rPr>
-      </w:pPr>
-      <w:r>
-        <w:rPr>
-          <w:highlight w:val="cyan"/>
+        <w:t xml:space="preserve">- sits over </w:t>
+      </w:r>
+      <w:proofErr w:type="spellStart"/>
+      <w:r>
+        <w:rPr>
           <w:lang w:val="en-IN"/>
         </w:rPr>
         <w:t>Oauth</w:t>
       </w:r>
+      <w:proofErr w:type="spellEnd"/>
+      <w:r>
+        <w:rPr>
+          <w:lang w:val="en-IN"/>
+        </w:rPr>
+        <w:t xml:space="preserve"> to do authentication (but people now uses </w:t>
+      </w:r>
+      <w:proofErr w:type="spellStart"/>
+      <w:r>
+        <w:rPr>
+          <w:lang w:val="en-IN"/>
+        </w:rPr>
+        <w:t>Oauth</w:t>
+      </w:r>
+      <w:proofErr w:type="spellEnd"/>
+      <w:r>
+        <w:rPr>
+          <w:lang w:val="en-IN"/>
+        </w:rPr>
+        <w:t xml:space="preserve"> for authentication using </w:t>
+      </w:r>
+      <w:proofErr w:type="spellStart"/>
+      <w:r>
+        <w:rPr>
+          <w:lang w:val="en-IN"/>
+        </w:rPr>
+        <w:t>sso</w:t>
+      </w:r>
+      <w:proofErr w:type="spellEnd"/>
+      <w:r>
+        <w:rPr>
+          <w:lang w:val="en-IN"/>
+        </w:rPr>
+        <w:t>)</w:t>
+      </w:r>
+    </w:p>
+    <w:p>
+      <w:pPr>
+        <w:rPr>
+          <w:lang w:val="en-IN"/>
+        </w:rPr>
+      </w:pPr>
+    </w:p>
+    <w:p>
+      <w:pPr>
+        <w:rPr>
+          <w:lang w:val="en-IN"/>
+        </w:rPr>
+      </w:pPr>
+      <w:proofErr w:type="spellStart"/>
+      <w:r>
+        <w:rPr>
+          <w:highlight w:val="cyan"/>
+          <w:lang w:val="en-IN"/>
+        </w:rPr>
+        <w:t>Oauth</w:t>
+      </w:r>
+      <w:proofErr w:type="spellEnd"/>
       <w:r>
         <w:rPr>
           <w:lang w:val="en-IN"/>
@@ -2203,7 +3291,21 @@
         <w:rPr>
           <w:lang w:val="en-IN"/>
         </w:rPr>
-        <w:t>- If we use this then resource server no need to access Auth server to verify the access token send by client server (it uses jwt private public key strategy not the signature signing one)</w:t>
+        <w:t xml:space="preserve">- If we use this then resource server no need to access Auth server to verify the access token send by client server (it uses </w:t>
+      </w:r>
+      <w:proofErr w:type="spellStart"/>
+      <w:r>
+        <w:rPr>
+          <w:lang w:val="en-IN"/>
+        </w:rPr>
+        <w:t>jwt</w:t>
+      </w:r>
+      <w:proofErr w:type="spellEnd"/>
+      <w:r>
+        <w:rPr>
+          <w:lang w:val="en-IN"/>
+        </w:rPr>
+        <w:t xml:space="preserve"> private public key strategy not the signature signing one)</w:t>
       </w:r>
     </w:p>
     <w:p>
@@ -2230,7 +3332,21 @@
         <w:rPr>
           <w:lang w:val="en-IN"/>
         </w:rPr>
-        <w:t>-It is just a string value that contains no meaningfull data like the JESSION token here to validate access token resource server sent request to auth server.</w:t>
+        <w:t xml:space="preserve">-It is just a string value that contains no </w:t>
+      </w:r>
+      <w:proofErr w:type="spellStart"/>
+      <w:r>
+        <w:rPr>
+          <w:lang w:val="en-IN"/>
+        </w:rPr>
+        <w:t>meaningfull</w:t>
+      </w:r>
+      <w:proofErr w:type="spellEnd"/>
+      <w:r>
+        <w:rPr>
+          <w:lang w:val="en-IN"/>
+        </w:rPr>
+        <w:t xml:space="preserve"> data like the JESSION token here to validate access token resource server sent request to auth server.</w:t>
       </w:r>
     </w:p>
     <w:p>
@@ -2343,6 +3459,7 @@
           <w:lang w:val="en-IN"/>
         </w:rPr>
       </w:pPr>
+      <w:proofErr w:type="spellStart"/>
       <w:r>
         <w:rPr>
           <w:highlight w:val="cyan"/>
@@ -2350,6 +3467,7 @@
         </w:rPr>
         <w:t>keyCLoack</w:t>
       </w:r>
+      <w:proofErr w:type="spellEnd"/>
       <w:r>
         <w:rPr>
           <w:lang w:val="en-IN"/>
@@ -2392,7 +3510,21 @@
         <w:rPr>
           <w:lang w:val="en-IN"/>
         </w:rPr>
-        <w:t xml:space="preserve">When we use Opaque token setup in keycloack then we have to add client scope for the client </w:t>
+        <w:t xml:space="preserve">When we use Opaque token setup in </w:t>
+      </w:r>
+      <w:proofErr w:type="spellStart"/>
+      <w:r>
+        <w:rPr>
+          <w:lang w:val="en-IN"/>
+        </w:rPr>
+        <w:t>keycloack</w:t>
+      </w:r>
+      <w:proofErr w:type="spellEnd"/>
+      <w:r>
+        <w:rPr>
+          <w:lang w:val="en-IN"/>
+        </w:rPr>
+        <w:t xml:space="preserve"> then we have to add client scope for the client </w:t>
       </w:r>
       <w:r>
         <w:rPr>
@@ -2451,27 +3583,139 @@
         <w:rPr>
           <w:lang w:val="en-IN"/>
         </w:rPr>
-        <w:t>For Eazybank Project the keyclock is setuped using docker and it is running at port 8180</w:t>
-      </w:r>
-    </w:p>
-    <w:p>
-      <w:pPr>
-        <w:rPr>
-          <w:lang w:val="en-IN"/>
-        </w:rPr>
-      </w:pPr>
-    </w:p>
-    <w:p>
-      <w:pPr>
-        <w:rPr>
-          <w:lang w:val="en-IN"/>
-        </w:rPr>
-      </w:pPr>
-      <w:r>
-        <w:rPr>
-          <w:lang w:val="en-IN"/>
-        </w:rPr>
-        <w:t>When we use keylock we then don’t need authentication as it will be handled by OIDC also user creation roles and all those tables are now handled in keyclock and not in database. We also don’t need AuthenticationManger, AutheticationProvider, UserService (loadUserByUsername)</w:t>
+        <w:t xml:space="preserve">For </w:t>
+      </w:r>
+      <w:proofErr w:type="spellStart"/>
+      <w:r>
+        <w:rPr>
+          <w:lang w:val="en-IN"/>
+        </w:rPr>
+        <w:t>Eazybank</w:t>
+      </w:r>
+      <w:proofErr w:type="spellEnd"/>
+      <w:r>
+        <w:rPr>
+          <w:lang w:val="en-IN"/>
+        </w:rPr>
+        <w:t xml:space="preserve"> Project the </w:t>
+      </w:r>
+      <w:proofErr w:type="spellStart"/>
+      <w:r>
+        <w:rPr>
+          <w:lang w:val="en-IN"/>
+        </w:rPr>
+        <w:t>keyclock</w:t>
+      </w:r>
+      <w:proofErr w:type="spellEnd"/>
+      <w:r>
+        <w:rPr>
+          <w:lang w:val="en-IN"/>
+        </w:rPr>
+        <w:t xml:space="preserve"> is </w:t>
+      </w:r>
+      <w:proofErr w:type="spellStart"/>
+      <w:r>
+        <w:rPr>
+          <w:lang w:val="en-IN"/>
+        </w:rPr>
+        <w:t>setuped</w:t>
+      </w:r>
+      <w:proofErr w:type="spellEnd"/>
+      <w:r>
+        <w:rPr>
+          <w:lang w:val="en-IN"/>
+        </w:rPr>
+        <w:t xml:space="preserve"> using docker and it is running at port 8180</w:t>
+      </w:r>
+    </w:p>
+    <w:p>
+      <w:pPr>
+        <w:rPr>
+          <w:lang w:val="en-IN"/>
+        </w:rPr>
+      </w:pPr>
+    </w:p>
+    <w:p>
+      <w:pPr>
+        <w:rPr>
+          <w:lang w:val="en-IN"/>
+        </w:rPr>
+      </w:pPr>
+      <w:r>
+        <w:rPr>
+          <w:lang w:val="en-IN"/>
+        </w:rPr>
+        <w:t xml:space="preserve">When we use keylock we then don’t need authentication as it will be handled by OIDC also user creation roles and all those tables are now handled in </w:t>
+      </w:r>
+      <w:proofErr w:type="spellStart"/>
+      <w:r>
+        <w:rPr>
+          <w:lang w:val="en-IN"/>
+        </w:rPr>
+        <w:t>keyclock</w:t>
+      </w:r>
+      <w:proofErr w:type="spellEnd"/>
+      <w:r>
+        <w:rPr>
+          <w:lang w:val="en-IN"/>
+        </w:rPr>
+        <w:t xml:space="preserve"> and not in database. We also don’t need </w:t>
+      </w:r>
+      <w:proofErr w:type="spellStart"/>
+      <w:r>
+        <w:rPr>
+          <w:lang w:val="en-IN"/>
+        </w:rPr>
+        <w:t>AuthenticationManger</w:t>
+      </w:r>
+      <w:proofErr w:type="spellEnd"/>
+      <w:r>
+        <w:rPr>
+          <w:lang w:val="en-IN"/>
+        </w:rPr>
+        <w:t xml:space="preserve">, </w:t>
+      </w:r>
+      <w:proofErr w:type="spellStart"/>
+      <w:r>
+        <w:rPr>
+          <w:lang w:val="en-IN"/>
+        </w:rPr>
+        <w:t>AutheticationProvider</w:t>
+      </w:r>
+      <w:proofErr w:type="spellEnd"/>
+      <w:r>
+        <w:rPr>
+          <w:lang w:val="en-IN"/>
+        </w:rPr>
+        <w:t xml:space="preserve">, </w:t>
+      </w:r>
+      <w:proofErr w:type="spellStart"/>
+      <w:r>
+        <w:rPr>
+          <w:lang w:val="en-IN"/>
+        </w:rPr>
+        <w:t>UserService</w:t>
+      </w:r>
+      <w:proofErr w:type="spellEnd"/>
+      <w:r>
+        <w:rPr>
+          <w:lang w:val="en-IN"/>
+        </w:rPr>
+        <w:t xml:space="preserve"> (</w:t>
+      </w:r>
+      <w:proofErr w:type="spellStart"/>
+      <w:r>
+        <w:rPr>
+          <w:lang w:val="en-IN"/>
+        </w:rPr>
+        <w:t>loadUserByUsername</w:t>
+      </w:r>
+      <w:proofErr w:type="spellEnd"/>
+      <w:r>
+        <w:rPr>
+          <w:lang w:val="en-IN"/>
+        </w:rPr>
+        <w:t>)</w:t>
       </w:r>
       <w:r>
         <w:rPr>
@@ -2503,67 +3747,279 @@
         <w:rPr>
           <w:lang w:val="en-IN"/>
         </w:rPr>
-        <w:t xml:space="preserve">In keyclock we can easily say what should be the password be like uppercase letter 1 etc </w:t>
-      </w:r>
-    </w:p>
-    <w:p>
-      <w:pPr>
-        <w:rPr>
-          <w:lang w:val="en-IN"/>
-        </w:rPr>
-      </w:pPr>
-    </w:p>
-    <w:p>
-      <w:pPr>
-        <w:rPr>
-          <w:lang w:val="en-IN"/>
-        </w:rPr>
-      </w:pPr>
-      <w:r>
-        <w:rPr>
-          <w:lang w:val="en-IN"/>
-        </w:rPr>
-        <w:t xml:space="preserve">MFA also can be setuped easily </w:t>
-      </w:r>
-    </w:p>
-    <w:p>
-      <w:pPr>
-        <w:rPr>
-          <w:lang w:val="en-IN"/>
-        </w:rPr>
-      </w:pPr>
-    </w:p>
-    <w:p>
-      <w:pPr>
-        <w:rPr>
-          <w:lang w:val="en-IN"/>
-        </w:rPr>
-      </w:pPr>
-      <w:r>
-        <w:rPr>
-          <w:lang w:val="en-IN"/>
-        </w:rPr>
-        <w:t xml:space="preserve">If we want to add social </w:t>
-      </w:r>
-      <w:proofErr w:type="gramStart"/>
-      <w:r>
-        <w:rPr>
-          <w:lang w:val="en-IN"/>
-        </w:rPr>
-        <w:t>logins</w:t>
-      </w:r>
-      <w:proofErr w:type="gramEnd"/>
-      <w:r>
-        <w:rPr>
-          <w:lang w:val="en-IN"/>
-        </w:rPr>
-        <w:t xml:space="preserve"> we call also add that using keyclock going to identity provider </w:t>
-      </w:r>
-      <w:r>
-        <w:rPr>
-          <w:lang w:val="en-IN"/>
-        </w:rPr>
-        <w:t>and those user that we access from sso a local record is created in user table of ketclock</w:t>
+        <w:t xml:space="preserve">In </w:t>
+      </w:r>
+      <w:proofErr w:type="spellStart"/>
+      <w:r>
+        <w:rPr>
+          <w:lang w:val="en-IN"/>
+        </w:rPr>
+        <w:t>keyclock</w:t>
+      </w:r>
+      <w:proofErr w:type="spellEnd"/>
+      <w:r>
+        <w:rPr>
+          <w:lang w:val="en-IN"/>
+        </w:rPr>
+        <w:t xml:space="preserve"> we can easily say what should be the password be like uppercase letter 1 etc </w:t>
+      </w:r>
+    </w:p>
+    <w:p>
+      <w:pPr>
+        <w:rPr>
+          <w:lang w:val="en-IN"/>
+        </w:rPr>
+      </w:pPr>
+    </w:p>
+    <w:p>
+      <w:pPr>
+        <w:rPr>
+          <w:lang w:val="en-IN"/>
+        </w:rPr>
+      </w:pPr>
+      <w:r>
+        <w:rPr>
+          <w:lang w:val="en-IN"/>
+        </w:rPr>
+        <w:t xml:space="preserve">MFA also can be </w:t>
+      </w:r>
+      <w:proofErr w:type="spellStart"/>
+      <w:r>
+        <w:rPr>
+          <w:lang w:val="en-IN"/>
+        </w:rPr>
+        <w:t>setuped</w:t>
+      </w:r>
+      <w:proofErr w:type="spellEnd"/>
+      <w:r>
+        <w:rPr>
+          <w:lang w:val="en-IN"/>
+        </w:rPr>
+        <w:t xml:space="preserve"> easily </w:t>
+      </w:r>
+    </w:p>
+    <w:p>
+      <w:pPr>
+        <w:rPr>
+          <w:lang w:val="en-IN"/>
+        </w:rPr>
+      </w:pPr>
+    </w:p>
+    <w:p>
+      <w:pPr>
+        <w:rPr>
+          <w:lang w:val="en-IN"/>
+        </w:rPr>
+      </w:pPr>
+      <w:r>
+        <w:rPr>
+          <w:lang w:val="en-IN"/>
+        </w:rPr>
+        <w:t xml:space="preserve">If we want to add social logins we call also add that using </w:t>
+      </w:r>
+      <w:proofErr w:type="spellStart"/>
+      <w:r>
+        <w:rPr>
+          <w:lang w:val="en-IN"/>
+        </w:rPr>
+        <w:t>keyclock</w:t>
+      </w:r>
+      <w:proofErr w:type="spellEnd"/>
+      <w:r>
+        <w:rPr>
+          <w:lang w:val="en-IN"/>
+        </w:rPr>
+        <w:t xml:space="preserve"> going to identity provider </w:t>
+      </w:r>
+      <w:r>
+        <w:rPr>
+          <w:lang w:val="en-IN"/>
+        </w:rPr>
+        <w:t xml:space="preserve">and those user that we access from </w:t>
+      </w:r>
+      <w:proofErr w:type="spellStart"/>
+      <w:r>
+        <w:rPr>
+          <w:lang w:val="en-IN"/>
+        </w:rPr>
+        <w:t>sso</w:t>
+      </w:r>
+      <w:proofErr w:type="spellEnd"/>
+      <w:r>
+        <w:rPr>
+          <w:lang w:val="en-IN"/>
+        </w:rPr>
+        <w:t xml:space="preserve"> a local record is created in user table of </w:t>
+      </w:r>
+      <w:proofErr w:type="spellStart"/>
+      <w:r>
+        <w:rPr>
+          <w:lang w:val="en-IN"/>
+        </w:rPr>
+        <w:t>ketclock</w:t>
+      </w:r>
+      <w:proofErr w:type="spellEnd"/>
+    </w:p>
+    <w:p>
+      <w:pPr>
+        <w:rPr>
+          <w:lang w:val="en-IN"/>
+        </w:rPr>
+      </w:pPr>
+    </w:p>
+    <w:p>
+      <w:pPr>
+        <w:rPr>
+          <w:lang w:val="en-IN"/>
+        </w:rPr>
+      </w:pPr>
+      <w:r>
+        <w:rPr>
+          <w:lang w:val="en-IN"/>
+        </w:rPr>
+        <w:t xml:space="preserve">To know the Authorization server </w:t>
+      </w:r>
+      <w:r>
+        <w:rPr>
+          <w:lang w:val="en-IN"/>
+        </w:rPr>
+        <w:t>d</w:t>
+      </w:r>
+      <w:r>
+        <w:rPr>
+          <w:lang w:val="en-IN"/>
+        </w:rPr>
+        <w:t xml:space="preserve">etail what we can do is in </w:t>
+      </w:r>
+      <w:r>
+        <w:rPr>
+          <w:lang w:val="en-IN"/>
+        </w:rPr>
+        <w:t xml:space="preserve"> the </w:t>
+      </w:r>
+      <w:proofErr w:type="spellStart"/>
+      <w:r>
+        <w:rPr>
+          <w:lang w:val="en-IN"/>
+        </w:rPr>
+        <w:t>url</w:t>
+      </w:r>
+      <w:proofErr w:type="spellEnd"/>
+      <w:r>
+        <w:rPr>
+          <w:lang w:val="en-IN"/>
+        </w:rPr>
+        <w:t xml:space="preserve"> just mention </w:t>
+      </w:r>
+    </w:p>
+    <w:p>
+      <w:pPr>
+        <w:rPr>
+          <w:lang w:val="en-IN"/>
+        </w:rPr>
+      </w:pPr>
+      <w:hyperlink r:id="rId4" w:history="1">
+        <w:r>
+          <w:rPr>
+            <w:rStyle w:val="Hyperlink"/>
+            <w:lang w:val="en-IN"/>
+          </w:rPr>
+          <w:t>http://localhost:</w:t>
+        </w:r>
+        <w:r>
+          <w:rPr>
+            <w:rStyle w:val="Hyperlink"/>
+            <w:lang w:val="en-IN"/>
+          </w:rPr>
+          <w:t xml:space="preserve"> </w:t>
+        </w:r>
+        <w:r>
+          <w:rPr>
+            <w:rStyle w:val="Hyperlink"/>
+            <w:lang w:val="en-IN"/>
+          </w:rPr>
+          <w:t>8180/.well-known/openid-configuration</w:t>
+        </w:r>
+      </w:hyperlink>
+      <w:r>
+        <w:rPr>
+          <w:lang w:val="en-IN"/>
+        </w:rPr>
+        <w:t xml:space="preserve"> where </w:t>
+      </w:r>
+      <w:hyperlink r:id="rId5" w:history="1">
+        <w:r>
+          <w:rPr>
+            <w:rStyle w:val="Hyperlink"/>
+            <w:lang w:val="en-IN"/>
+          </w:rPr>
+          <w:t>http://localhost:</w:t>
+        </w:r>
+        <w:r>
+          <w:rPr>
+            <w:lang w:val="en-IN"/>
+          </w:rPr>
+          <w:t xml:space="preserve"> </w:t>
+        </w:r>
+        <w:r>
+          <w:rPr>
+            <w:lang w:val="en-IN"/>
+          </w:rPr>
+          <w:t>8180</w:t>
+        </w:r>
+        <w:r>
+          <w:rPr>
+            <w:rStyle w:val="Hyperlink"/>
+            <w:lang w:val="en-IN"/>
+          </w:rPr>
+          <w:t>/</w:t>
+        </w:r>
+      </w:hyperlink>
+      <w:r>
+        <w:rPr>
+          <w:lang w:val="en-IN"/>
+        </w:rPr>
+        <w:t xml:space="preserve"> can be anything according to our domain It will change</w:t>
+      </w:r>
+    </w:p>
+    <w:p>
+      <w:pPr>
+        <w:rPr>
+          <w:lang w:val="en-IN"/>
+        </w:rPr>
+      </w:pPr>
+    </w:p>
+    <w:p>
+      <w:r>
+        <w:rPr>
+          <w:highlight w:val="cyan"/>
+        </w:rPr>
+        <w:t>Functional Interface</w:t>
+      </w:r>
+    </w:p>
+    <w:p/>
+    <w:p>
+      <w:r>
+        <w:t xml:space="preserve">This can be mentioned as an annotation to a interface where we just have one function. </w:t>
+      </w:r>
+    </w:p>
+    <w:p/>
+    <w:p>
+      <w:pPr>
+        <w:rPr>
+          <w:lang w:val="en-IN"/>
+        </w:rPr>
+      </w:pPr>
+      <w:r>
+        <w:t xml:space="preserve">So when this Interface is called we can use </w:t>
+      </w:r>
+      <w:proofErr w:type="spellStart"/>
+      <w:r>
+        <w:t>lamda</w:t>
+      </w:r>
+      <w:proofErr w:type="spellEnd"/>
+      <w:r>
+        <w:t xml:space="preserve"> function to declare that function.  </w:t>
       </w:r>
       <w:r>
         <w:rPr>
@@ -2962,7 +4418,6 @@
   <w:style w:type="character" w:default="1" w:styleId="DefaultParagraphFont">
     <w:name w:val="Default Paragraph Font"/>
     <w:uiPriority w:val="1"/>
-    <w:semiHidden/>
     <w:unhideWhenUsed/>
   </w:style>
   <w:style w:type="table" w:default="1" w:styleId="TableNormal">
@@ -3014,6 +4469,27 @@
       <w:sz w:val="24"/>
       <w:szCs w:val="24"/>
       <w:lang w:eastAsia="zh-CN"/>
+    </w:rPr>
+  </w:style>
+  <w:style w:type="character" w:styleId="Hyperlink">
+    <w:name w:val="Hyperlink"/>
+    <w:basedOn w:val="DefaultParagraphFont"/>
+    <w:rsid w:val="000D52F3"/>
+    <w:rPr>
+      <w:color w:val="0026E5" w:themeColor="hyperlink"/>
+      <w:u w:val="single"/>
+    </w:rPr>
+  </w:style>
+  <w:style w:type="character" w:styleId="UnresolvedMention">
+    <w:name w:val="Unresolved Mention"/>
+    <w:basedOn w:val="DefaultParagraphFont"/>
+    <w:uiPriority w:val="99"/>
+    <w:semiHidden/>
+    <w:unhideWhenUsed/>
+    <w:rsid w:val="000D52F3"/>
+    <w:rPr>
+      <w:color w:val="605E5C"/>
+      <w:shd w:val="clear" w:color="auto" w:fill="E1DFDD"/>
     </w:rPr>
   </w:style>
 </w:styles>

</xml_diff>